<commit_message>
Update presentation, Phyla and interface
</commit_message>
<xml_diff>
--- a/GRUPO F/docs/Manual de Ususario Sistema Experto.docx
+++ b/GRUPO F/docs/Manual de Ususario Sistema Experto.docx
@@ -852,25 +852,7 @@
     </w:p>
     <w:p>
       <w:pPr>
-        <w:jc w:val="center"/>
-        <w:rPr>
-          <w:rFonts w:ascii="Times New Roman" w:hAnsi="Times New Roman" w:cs="Times New Roman"/>
-          <w:sz w:val="24"/>
-          <w:szCs w:val="24"/>
-        </w:rPr>
-      </w:pPr>
-      <w:r>
-        <w:rPr>
-          <w:rFonts w:ascii="Times New Roman" w:hAnsi="Times New Roman" w:cs="Times New Roman"/>
-          <w:b/>
-          <w:sz w:val="24"/>
-          <w:szCs w:val="24"/>
-        </w:rPr>
-        <w:t>Instalación</w:t>
-      </w:r>
-    </w:p>
-    <w:p>
-      <w:pPr>
+        <w:ind w:firstLine="0"/>
         <w:jc w:val="left"/>
         <w:rPr>
           <w:rFonts w:ascii="Times New Roman" w:hAnsi="Times New Roman" w:cs="Times New Roman"/>
@@ -884,7 +866,23 @@
           <w:sz w:val="24"/>
           <w:szCs w:val="24"/>
         </w:rPr>
-        <w:t>Librerías a instalar:</w:t>
+        <w:t xml:space="preserve">Para instalar Python puede visitar su </w:t>
+      </w:r>
+      <w:r>
+        <w:rPr>
+          <w:rFonts w:ascii="Times New Roman" w:hAnsi="Times New Roman" w:cs="Times New Roman"/>
+          <w:sz w:val="24"/>
+          <w:szCs w:val="24"/>
+        </w:rPr>
+        <w:t>página</w:t>
+      </w:r>
+      <w:r>
+        <w:rPr>
+          <w:rFonts w:ascii="Times New Roman" w:hAnsi="Times New Roman" w:cs="Times New Roman"/>
+          <w:sz w:val="24"/>
+          <w:szCs w:val="24"/>
+        </w:rPr>
+        <w:t xml:space="preserve"> oficial:</w:t>
       </w:r>
     </w:p>
     <w:p>
@@ -892,196 +890,15 @@
         <w:pStyle w:val="Prrafodelista"/>
         <w:numPr>
           <w:ilvl w:val="0"/>
-          <w:numId w:val="3"/>
+          <w:numId w:val="1"/>
         </w:numPr>
         <w:jc w:val="left"/>
         <w:rPr>
           <w:rFonts w:ascii="Times New Roman" w:hAnsi="Times New Roman" w:cs="Times New Roman"/>
           <w:sz w:val="24"/>
           <w:szCs w:val="24"/>
-          <w:lang w:val="en-US"/>
-        </w:rPr>
-      </w:pPr>
-      <w:r>
-        <w:rPr>
-          <w:rFonts w:ascii="Times New Roman" w:hAnsi="Times New Roman" w:cs="Times New Roman"/>
-          <w:sz w:val="24"/>
-          <w:szCs w:val="24"/>
-          <w:lang w:val="en-US"/>
-        </w:rPr>
-        <w:t>Pipenv:</w:t>
-      </w:r>
-      <w:r>
-        <w:rPr>
-          <w:rFonts w:ascii="Times New Roman" w:hAnsi="Times New Roman" w:cs="Times New Roman"/>
-          <w:sz w:val="24"/>
-          <w:szCs w:val="24"/>
-          <w:lang w:val="en-US"/>
-        </w:rPr>
-        <w:t xml:space="preserve"> pip install --user pipenv.</w:t>
-      </w:r>
-    </w:p>
-    <w:p>
-      <w:pPr>
-        <w:pStyle w:val="Prrafodelista"/>
-        <w:numPr>
-          <w:ilvl w:val="0"/>
-          <w:numId w:val="3"/>
-        </w:numPr>
-        <w:jc w:val="left"/>
-        <w:rPr>
-          <w:rFonts w:ascii="Times New Roman" w:hAnsi="Times New Roman" w:cs="Times New Roman"/>
-          <w:sz w:val="24"/>
-          <w:szCs w:val="24"/>
-          <w:lang w:val="en-US"/>
-        </w:rPr>
-      </w:pPr>
-      <w:r>
-        <w:rPr>
-          <w:rFonts w:ascii="Times New Roman" w:hAnsi="Times New Roman" w:cs="Times New Roman"/>
-          <w:sz w:val="24"/>
-          <w:szCs w:val="24"/>
-          <w:lang w:val="en-US"/>
-        </w:rPr>
-        <w:t>Customtkinter</w:t>
-      </w:r>
-      <w:r>
-        <w:rPr>
-          <w:rFonts w:ascii="Times New Roman" w:hAnsi="Times New Roman" w:cs="Times New Roman"/>
-          <w:sz w:val="24"/>
-          <w:szCs w:val="24"/>
-          <w:lang w:val="en-US"/>
-        </w:rPr>
-        <w:t xml:space="preserve">: </w:t>
-      </w:r>
-      <w:r>
-        <w:rPr>
-          <w:rFonts w:ascii="Times New Roman" w:hAnsi="Times New Roman" w:cs="Times New Roman"/>
-          <w:sz w:val="24"/>
-          <w:szCs w:val="24"/>
-          <w:lang w:val="en-US"/>
-        </w:rPr>
-        <w:t>pip install --user customtkinter</w:t>
-      </w:r>
-      <w:r>
-        <w:rPr>
-          <w:rFonts w:ascii="Times New Roman" w:hAnsi="Times New Roman" w:cs="Times New Roman"/>
-          <w:sz w:val="24"/>
-          <w:szCs w:val="24"/>
-          <w:lang w:val="en-US"/>
-        </w:rPr>
-        <w:t>.</w:t>
-      </w:r>
-    </w:p>
-    <w:p>
-      <w:pPr>
-        <w:pStyle w:val="Prrafodelista"/>
-        <w:numPr>
-          <w:ilvl w:val="0"/>
-          <w:numId w:val="3"/>
-        </w:numPr>
-        <w:jc w:val="left"/>
-        <w:rPr>
-          <w:rFonts w:ascii="Times New Roman" w:hAnsi="Times New Roman" w:cs="Times New Roman"/>
-          <w:sz w:val="24"/>
-          <w:szCs w:val="24"/>
-          <w:lang w:val="en-US"/>
-        </w:rPr>
-      </w:pPr>
-      <w:r>
-        <w:rPr>
-          <w:rFonts w:ascii="Times New Roman" w:hAnsi="Times New Roman" w:cs="Times New Roman"/>
-          <w:sz w:val="24"/>
-          <w:szCs w:val="24"/>
-          <w:lang w:val="en-US"/>
-        </w:rPr>
-        <w:t>Pillow</w:t>
-      </w:r>
-      <w:r>
-        <w:rPr>
-          <w:rFonts w:ascii="Times New Roman" w:hAnsi="Times New Roman" w:cs="Times New Roman"/>
-          <w:sz w:val="24"/>
-          <w:szCs w:val="24"/>
-          <w:lang w:val="en-US"/>
-        </w:rPr>
-        <w:t xml:space="preserve">: </w:t>
-      </w:r>
-      <w:r>
-        <w:rPr>
-          <w:rFonts w:ascii="Times New Roman" w:hAnsi="Times New Roman" w:cs="Times New Roman"/>
-          <w:sz w:val="24"/>
-          <w:szCs w:val="24"/>
-          <w:lang w:val="en-US"/>
-        </w:rPr>
-        <w:t>pip install</w:t>
-      </w:r>
-      <w:r>
-        <w:rPr>
-          <w:rFonts w:ascii="Times New Roman" w:hAnsi="Times New Roman" w:cs="Times New Roman"/>
-          <w:sz w:val="24"/>
-          <w:szCs w:val="24"/>
-          <w:lang w:val="en-US"/>
-        </w:rPr>
-        <w:t xml:space="preserve"> --user</w:t>
-      </w:r>
-      <w:r>
-        <w:rPr>
-          <w:rFonts w:ascii="Times New Roman" w:hAnsi="Times New Roman" w:cs="Times New Roman"/>
-          <w:sz w:val="24"/>
-          <w:szCs w:val="24"/>
-          <w:lang w:val="en-US"/>
-        </w:rPr>
-        <w:t xml:space="preserve"> pillow</w:t>
-      </w:r>
-    </w:p>
-    <w:p>
-      <w:pPr>
-        <w:jc w:val="left"/>
-        <w:rPr>
-          <w:rFonts w:ascii="Times New Roman" w:hAnsi="Times New Roman" w:cs="Times New Roman"/>
-          <w:sz w:val="24"/>
-          <w:szCs w:val="24"/>
-          <w:lang w:val="es-ES"/>
-        </w:rPr>
-      </w:pPr>
-      <w:r>
-        <w:rPr>
-          <w:rFonts w:ascii="Times New Roman" w:hAnsi="Times New Roman" w:cs="Times New Roman"/>
-          <w:sz w:val="24"/>
-          <w:szCs w:val="24"/>
-          <w:lang w:val="es-ES"/>
-        </w:rPr>
-        <w:t>Estos requisitos e instrucciones de instalación también están especificados en el archiv</w:t>
-      </w:r>
-      <w:r>
-        <w:rPr>
-          <w:rFonts w:ascii="Times New Roman" w:hAnsi="Times New Roman" w:cs="Times New Roman"/>
-          <w:sz w:val="24"/>
-          <w:szCs w:val="24"/>
-          <w:lang w:val="es-ES"/>
-        </w:rPr>
-        <w:t>o README.md del repositorio del sistema.</w:t>
-      </w:r>
-    </w:p>
-    <w:p>
-      <w:pPr>
-        <w:jc w:val="left"/>
-        <w:rPr>
-          <w:rFonts w:ascii="Times New Roman" w:hAnsi="Times New Roman" w:cs="Times New Roman"/>
-          <w:sz w:val="24"/>
-          <w:szCs w:val="24"/>
-          <w:lang w:val="es-ES"/>
-        </w:rPr>
-      </w:pPr>
-      <w:r>
-        <w:rPr>
-          <w:rFonts w:ascii="Times New Roman" w:hAnsi="Times New Roman" w:cs="Times New Roman"/>
-          <w:sz w:val="24"/>
-          <w:szCs w:val="24"/>
-          <w:lang w:val="es-ES"/>
-        </w:rPr>
-        <w:t xml:space="preserve">Enlace del repositorio: </w:t>
-      </w:r>
+        </w:rPr>
+      </w:pPr>
       <w:hyperlink r:id="rId7" w:history="1">
         <w:r>
           <w:rPr>
@@ -1089,11 +906,706 @@
             <w:rFonts w:ascii="Times New Roman" w:hAnsi="Times New Roman" w:cs="Times New Roman"/>
             <w:sz w:val="24"/>
             <w:szCs w:val="24"/>
-            <w:lang w:val="es-ES"/>
           </w:rPr>
-          <w:t>https://github.com/Deivisito2911/expert_systems</w:t>
+          <w:t>https://www.python.org/</w:t>
         </w:r>
       </w:hyperlink>
+    </w:p>
+    <w:p>
+      <w:pPr>
+        <w:ind w:firstLine="0"/>
+        <w:jc w:val="left"/>
+        <w:rPr>
+          <w:rFonts w:ascii="Times New Roman" w:hAnsi="Times New Roman" w:cs="Times New Roman"/>
+          <w:sz w:val="24"/>
+          <w:szCs w:val="24"/>
+        </w:rPr>
+      </w:pPr>
+      <w:r>
+        <w:rPr>
+          <w:rFonts w:ascii="Times New Roman" w:hAnsi="Times New Roman" w:cs="Times New Roman"/>
+          <w:sz w:val="24"/>
+          <w:szCs w:val="24"/>
+        </w:rPr>
+        <w:t xml:space="preserve">Igualmente le dejamos un enlace de </w:t>
+      </w:r>
+      <w:r>
+        <w:rPr>
+          <w:rFonts w:ascii="Times New Roman" w:hAnsi="Times New Roman" w:cs="Times New Roman"/>
+          <w:sz w:val="24"/>
+          <w:szCs w:val="24"/>
+        </w:rPr>
+        <w:t>YouTube</w:t>
+      </w:r>
+      <w:r>
+        <w:rPr>
+          <w:rFonts w:ascii="Times New Roman" w:hAnsi="Times New Roman" w:cs="Times New Roman"/>
+          <w:sz w:val="24"/>
+          <w:szCs w:val="24"/>
+        </w:rPr>
+        <w:t xml:space="preserve"> donde puede ver el proceso de instalación de forma </w:t>
+      </w:r>
+      <w:r>
+        <w:rPr>
+          <w:rFonts w:ascii="Times New Roman" w:hAnsi="Times New Roman" w:cs="Times New Roman"/>
+          <w:sz w:val="24"/>
+          <w:szCs w:val="24"/>
+        </w:rPr>
+        <w:t>más</w:t>
+      </w:r>
+      <w:r>
+        <w:rPr>
+          <w:rFonts w:ascii="Times New Roman" w:hAnsi="Times New Roman" w:cs="Times New Roman"/>
+          <w:sz w:val="24"/>
+          <w:szCs w:val="24"/>
+        </w:rPr>
+        <w:t xml:space="preserve"> detallada junto con la </w:t>
+      </w:r>
+      <w:r>
+        <w:rPr>
+          <w:rFonts w:ascii="Times New Roman" w:hAnsi="Times New Roman" w:cs="Times New Roman"/>
+          <w:sz w:val="24"/>
+          <w:szCs w:val="24"/>
+        </w:rPr>
+        <w:t>instalación</w:t>
+      </w:r>
+      <w:r>
+        <w:rPr>
+          <w:rFonts w:ascii="Times New Roman" w:hAnsi="Times New Roman" w:cs="Times New Roman"/>
+          <w:sz w:val="24"/>
+          <w:szCs w:val="24"/>
+        </w:rPr>
+        <w:t xml:space="preserve"> de Visual Studio Code para facilitar la corrida del programa:</w:t>
+      </w:r>
+    </w:p>
+    <w:p>
+      <w:pPr>
+        <w:pStyle w:val="Prrafodelista"/>
+        <w:numPr>
+          <w:ilvl w:val="0"/>
+          <w:numId w:val="1"/>
+        </w:numPr>
+        <w:jc w:val="left"/>
+        <w:rPr>
+          <w:rFonts w:ascii="Times New Roman" w:hAnsi="Times New Roman" w:cs="Times New Roman"/>
+          <w:sz w:val="24"/>
+          <w:szCs w:val="24"/>
+        </w:rPr>
+      </w:pPr>
+      <w:hyperlink r:id="rId8" w:history="1">
+        <w:r>
+          <w:rPr>
+            <w:rStyle w:val="Hipervnculo"/>
+            <w:rFonts w:ascii="Times New Roman" w:hAnsi="Times New Roman" w:cs="Times New Roman"/>
+            <w:sz w:val="24"/>
+            <w:szCs w:val="24"/>
+          </w:rPr>
+          <w:t>https://www.youtube.com/watch?v=-IyA_Yvs8IQ&amp;pp=ygUSaW5zdGFsYWNpb24gcHl0aG9u</w:t>
+        </w:r>
+      </w:hyperlink>
+    </w:p>
+    <w:p>
+      <w:pPr>
+        <w:pStyle w:val="Prrafodelista"/>
+        <w:numPr>
+          <w:ilvl w:val="0"/>
+          <w:numId w:val="1"/>
+        </w:numPr>
+        <w:jc w:val="left"/>
+        <w:rPr>
+          <w:rFonts w:ascii="Times New Roman" w:hAnsi="Times New Roman" w:cs="Times New Roman"/>
+          <w:sz w:val="24"/>
+          <w:szCs w:val="24"/>
+        </w:rPr>
+      </w:pPr>
+    </w:p>
+    <w:p>
+      <w:pPr>
+        <w:jc w:val="center"/>
+        <w:rPr>
+          <w:rFonts w:ascii="Times New Roman" w:hAnsi="Times New Roman" w:cs="Times New Roman"/>
+          <w:b/>
+          <w:sz w:val="24"/>
+          <w:szCs w:val="24"/>
+        </w:rPr>
+      </w:pPr>
+      <w:r>
+        <w:rPr>
+          <w:rFonts w:ascii="Times New Roman" w:hAnsi="Times New Roman" w:cs="Times New Roman"/>
+          <w:b/>
+          <w:sz w:val="24"/>
+          <w:szCs w:val="24"/>
+        </w:rPr>
+        <w:t>Instalación</w:t>
+      </w:r>
+    </w:p>
+    <w:p>
+      <w:pPr>
+        <w:jc w:val="left"/>
+        <w:rPr>
+          <w:rFonts w:ascii="Times New Roman" w:hAnsi="Times New Roman" w:cs="Times New Roman"/>
+          <w:sz w:val="24"/>
+          <w:szCs w:val="24"/>
+        </w:rPr>
+      </w:pPr>
+      <w:r>
+        <w:rPr>
+          <w:rFonts w:ascii="Times New Roman" w:hAnsi="Times New Roman" w:cs="Times New Roman"/>
+          <w:sz w:val="24"/>
+          <w:szCs w:val="24"/>
+        </w:rPr>
+        <w:t>Librerías a instalar:</w:t>
+      </w:r>
+    </w:p>
+    <w:p>
+      <w:pPr>
+        <w:pStyle w:val="Prrafodelista"/>
+        <w:numPr>
+          <w:ilvl w:val="0"/>
+          <w:numId w:val="3"/>
+        </w:numPr>
+        <w:jc w:val="left"/>
+        <w:rPr>
+          <w:rFonts w:ascii="Times New Roman" w:hAnsi="Times New Roman" w:cs="Times New Roman"/>
+          <w:sz w:val="24"/>
+          <w:szCs w:val="24"/>
+          <w:lang w:val="en-US"/>
+        </w:rPr>
+      </w:pPr>
+      <w:r>
+        <w:rPr>
+          <w:rFonts w:ascii="Times New Roman" w:hAnsi="Times New Roman" w:cs="Times New Roman"/>
+          <w:sz w:val="24"/>
+          <w:szCs w:val="24"/>
+          <w:lang w:val="en-US"/>
+        </w:rPr>
+        <w:t>Pipenv:</w:t>
+      </w:r>
+      <w:r>
+        <w:rPr>
+          <w:rFonts w:ascii="Times New Roman" w:hAnsi="Times New Roman" w:cs="Times New Roman"/>
+          <w:sz w:val="24"/>
+          <w:szCs w:val="24"/>
+          <w:lang w:val="en-US"/>
+        </w:rPr>
+        <w:t xml:space="preserve"> pip install --user pipenv.</w:t>
+      </w:r>
+    </w:p>
+    <w:p>
+      <w:pPr>
+        <w:pStyle w:val="Prrafodelista"/>
+        <w:numPr>
+          <w:ilvl w:val="0"/>
+          <w:numId w:val="3"/>
+        </w:numPr>
+        <w:jc w:val="left"/>
+        <w:rPr>
+          <w:rFonts w:ascii="Times New Roman" w:hAnsi="Times New Roman" w:cs="Times New Roman"/>
+          <w:sz w:val="24"/>
+          <w:szCs w:val="24"/>
+          <w:lang w:val="en-US"/>
+        </w:rPr>
+      </w:pPr>
+      <w:r>
+        <w:rPr>
+          <w:rFonts w:ascii="Times New Roman" w:hAnsi="Times New Roman" w:cs="Times New Roman"/>
+          <w:sz w:val="24"/>
+          <w:szCs w:val="24"/>
+          <w:lang w:val="en-US"/>
+        </w:rPr>
+        <w:t>Customtkinter</w:t>
+      </w:r>
+      <w:r>
+        <w:rPr>
+          <w:rFonts w:ascii="Times New Roman" w:hAnsi="Times New Roman" w:cs="Times New Roman"/>
+          <w:sz w:val="24"/>
+          <w:szCs w:val="24"/>
+          <w:lang w:val="en-US"/>
+        </w:rPr>
+        <w:t xml:space="preserve">: </w:t>
+      </w:r>
+      <w:r>
+        <w:rPr>
+          <w:rFonts w:ascii="Times New Roman" w:hAnsi="Times New Roman" w:cs="Times New Roman"/>
+          <w:sz w:val="24"/>
+          <w:szCs w:val="24"/>
+          <w:lang w:val="en-US"/>
+        </w:rPr>
+        <w:t>pip install --user customtkinter</w:t>
+      </w:r>
+      <w:r>
+        <w:rPr>
+          <w:rFonts w:ascii="Times New Roman" w:hAnsi="Times New Roman" w:cs="Times New Roman"/>
+          <w:sz w:val="24"/>
+          <w:szCs w:val="24"/>
+          <w:lang w:val="en-US"/>
+        </w:rPr>
+        <w:t>.</w:t>
+      </w:r>
+    </w:p>
+    <w:p>
+      <w:pPr>
+        <w:pStyle w:val="Prrafodelista"/>
+        <w:numPr>
+          <w:ilvl w:val="0"/>
+          <w:numId w:val="3"/>
+        </w:numPr>
+        <w:jc w:val="left"/>
+        <w:rPr>
+          <w:rFonts w:ascii="Times New Roman" w:hAnsi="Times New Roman" w:cs="Times New Roman"/>
+          <w:sz w:val="24"/>
+          <w:szCs w:val="24"/>
+          <w:lang w:val="en-US"/>
+        </w:rPr>
+      </w:pPr>
+      <w:r>
+        <w:rPr>
+          <w:rFonts w:ascii="Times New Roman" w:hAnsi="Times New Roman" w:cs="Times New Roman"/>
+          <w:sz w:val="24"/>
+          <w:szCs w:val="24"/>
+          <w:lang w:val="en-US"/>
+        </w:rPr>
+        <w:t>Pillow</w:t>
+      </w:r>
+      <w:r>
+        <w:rPr>
+          <w:rFonts w:ascii="Times New Roman" w:hAnsi="Times New Roman" w:cs="Times New Roman"/>
+          <w:sz w:val="24"/>
+          <w:szCs w:val="24"/>
+          <w:lang w:val="en-US"/>
+        </w:rPr>
+        <w:t xml:space="preserve">: </w:t>
+      </w:r>
+      <w:r>
+        <w:rPr>
+          <w:rFonts w:ascii="Times New Roman" w:hAnsi="Times New Roman" w:cs="Times New Roman"/>
+          <w:sz w:val="24"/>
+          <w:szCs w:val="24"/>
+          <w:lang w:val="en-US"/>
+        </w:rPr>
+        <w:t>pip install</w:t>
+      </w:r>
+      <w:r>
+        <w:rPr>
+          <w:rFonts w:ascii="Times New Roman" w:hAnsi="Times New Roman" w:cs="Times New Roman"/>
+          <w:sz w:val="24"/>
+          <w:szCs w:val="24"/>
+          <w:lang w:val="en-US"/>
+        </w:rPr>
+        <w:t xml:space="preserve"> --user</w:t>
+      </w:r>
+      <w:r>
+        <w:rPr>
+          <w:rFonts w:ascii="Times New Roman" w:hAnsi="Times New Roman" w:cs="Times New Roman"/>
+          <w:sz w:val="24"/>
+          <w:szCs w:val="24"/>
+          <w:lang w:val="en-US"/>
+        </w:rPr>
+        <w:t xml:space="preserve"> pillow</w:t>
+      </w:r>
+    </w:p>
+    <w:p>
+      <w:pPr>
+        <w:jc w:val="left"/>
+        <w:rPr>
+          <w:rFonts w:ascii="Times New Roman" w:hAnsi="Times New Roman" w:cs="Times New Roman"/>
+          <w:sz w:val="24"/>
+          <w:szCs w:val="24"/>
+          <w:lang w:val="es-ES"/>
+        </w:rPr>
+      </w:pPr>
+      <w:r>
+        <w:rPr>
+          <w:rFonts w:ascii="Times New Roman" w:hAnsi="Times New Roman" w:cs="Times New Roman"/>
+          <w:sz w:val="24"/>
+          <w:szCs w:val="24"/>
+          <w:lang w:val="es-ES"/>
+        </w:rPr>
+        <w:t xml:space="preserve">Para </w:t>
+      </w:r>
+      <w:r>
+        <w:rPr>
+          <w:rFonts w:ascii="Times New Roman" w:hAnsi="Times New Roman" w:cs="Times New Roman"/>
+          <w:sz w:val="24"/>
+          <w:szCs w:val="24"/>
+          <w:lang w:val="es-ES"/>
+        </w:rPr>
+        <w:t>instalar las</w:t>
+      </w:r>
+      <w:r>
+        <w:rPr>
+          <w:rFonts w:ascii="Times New Roman" w:hAnsi="Times New Roman" w:cs="Times New Roman"/>
+          <w:sz w:val="24"/>
+          <w:szCs w:val="24"/>
+          <w:lang w:val="es-ES"/>
+        </w:rPr>
+        <w:t xml:space="preserve"> </w:t>
+      </w:r>
+      <w:r>
+        <w:rPr>
+          <w:rFonts w:ascii="Times New Roman" w:hAnsi="Times New Roman" w:cs="Times New Roman"/>
+          <w:sz w:val="24"/>
+          <w:szCs w:val="24"/>
+          <w:lang w:val="es-ES"/>
+        </w:rPr>
+        <w:t>librerías</w:t>
+      </w:r>
+      <w:r>
+        <w:rPr>
+          <w:rFonts w:ascii="Times New Roman" w:hAnsi="Times New Roman" w:cs="Times New Roman"/>
+          <w:sz w:val="24"/>
+          <w:szCs w:val="24"/>
+          <w:lang w:val="es-ES"/>
+        </w:rPr>
+        <w:t xml:space="preserve"> </w:t>
+      </w:r>
+      <w:r>
+        <w:rPr>
+          <w:rFonts w:ascii="Times New Roman" w:hAnsi="Times New Roman" w:cs="Times New Roman"/>
+          <w:sz w:val="24"/>
+          <w:szCs w:val="24"/>
+          <w:lang w:val="es-ES"/>
+        </w:rPr>
+        <w:t>deberá</w:t>
+      </w:r>
+      <w:r>
+        <w:rPr>
+          <w:rFonts w:ascii="Times New Roman" w:hAnsi="Times New Roman" w:cs="Times New Roman"/>
+          <w:sz w:val="24"/>
+          <w:szCs w:val="24"/>
+          <w:lang w:val="es-ES"/>
+        </w:rPr>
+        <w:t xml:space="preserve"> seguir </w:t>
+      </w:r>
+      <w:r>
+        <w:rPr>
+          <w:rFonts w:ascii="Times New Roman" w:hAnsi="Times New Roman" w:cs="Times New Roman"/>
+          <w:sz w:val="24"/>
+          <w:szCs w:val="24"/>
+          <w:lang w:val="es-ES"/>
+        </w:rPr>
+        <w:t>los siguientes paso</w:t>
+      </w:r>
+      <w:bookmarkStart w:id="0" w:name="_GoBack"/>
+      <w:bookmarkEnd w:id="0"/>
+      <w:r>
+        <w:rPr>
+          <w:rFonts w:ascii="Times New Roman" w:hAnsi="Times New Roman" w:cs="Times New Roman"/>
+          <w:sz w:val="24"/>
+          <w:szCs w:val="24"/>
+          <w:lang w:val="es-ES"/>
+        </w:rPr>
+        <w:t>s</w:t>
+      </w:r>
+      <w:r>
+        <w:rPr>
+          <w:rFonts w:ascii="Times New Roman" w:hAnsi="Times New Roman" w:cs="Times New Roman"/>
+          <w:sz w:val="24"/>
+          <w:szCs w:val="24"/>
+          <w:lang w:val="es-ES"/>
+        </w:rPr>
+        <w:t>:</w:t>
+      </w:r>
+    </w:p>
+    <w:p>
+      <w:pPr>
+        <w:pStyle w:val="Prrafodelista"/>
+        <w:numPr>
+          <w:ilvl w:val="0"/>
+          <w:numId w:val="5"/>
+        </w:numPr>
+        <w:jc w:val="left"/>
+        <w:rPr>
+          <w:rFonts w:ascii="Times New Roman" w:hAnsi="Times New Roman" w:cs="Times New Roman"/>
+          <w:sz w:val="24"/>
+          <w:szCs w:val="24"/>
+          <w:lang w:val="es-ES"/>
+        </w:rPr>
+      </w:pPr>
+      <w:r>
+        <w:rPr>
+          <w:rFonts w:ascii="Times New Roman" w:hAnsi="Times New Roman" w:cs="Times New Roman"/>
+          <w:sz w:val="24"/>
+          <w:szCs w:val="24"/>
+          <w:lang w:val="es-ES"/>
+        </w:rPr>
+        <w:t xml:space="preserve">Dar click derecho en el entorno Visual Studio Code donde </w:t>
+      </w:r>
+      <w:r>
+        <w:rPr>
+          <w:rFonts w:ascii="Times New Roman" w:hAnsi="Times New Roman" w:cs="Times New Roman"/>
+          <w:sz w:val="24"/>
+          <w:szCs w:val="24"/>
+          <w:lang w:val="es-ES"/>
+        </w:rPr>
+        <w:t>está</w:t>
+      </w:r>
+      <w:r>
+        <w:rPr>
+          <w:rFonts w:ascii="Times New Roman" w:hAnsi="Times New Roman" w:cs="Times New Roman"/>
+          <w:sz w:val="24"/>
+          <w:szCs w:val="24"/>
+          <w:lang w:val="es-ES"/>
+        </w:rPr>
+        <w:t xml:space="preserve"> el archivo main y presionar abrir terminal Integrado.</w:t>
+      </w:r>
+      <w:r>
+        <w:rPr>
+          <w:rFonts w:ascii="Times New Roman" w:hAnsi="Times New Roman" w:cs="Times New Roman"/>
+          <w:sz w:val="24"/>
+          <w:szCs w:val="24"/>
+          <w:lang w:val="es-ES"/>
+        </w:rPr>
+        <w:br/>
+      </w:r>
+      <w:r>
+        <w:rPr>
+          <w:rFonts w:ascii="Times New Roman" w:hAnsi="Times New Roman" w:cs="Times New Roman"/>
+          <w:sz w:val="24"/>
+          <w:szCs w:val="24"/>
+          <w:lang w:val="es-ES"/>
+        </w:rPr>
+        <w:drawing>
+          <wp:inline distT="0" distB="0" distL="0" distR="0" wp14:anchorId="05239205" wp14:editId="36DBF471">
+            <wp:extent cx="5400040" cy="2707640"/>
+            <wp:effectExtent l="0" t="0" r="0" b="0"/>
+            <wp:docPr id="2" name="Imagen 2"/>
+            <wp:cNvGraphicFramePr>
+              <a:graphicFrameLocks xmlns:a="http://schemas.openxmlformats.org/drawingml/2006/main" noChangeAspect="1"/>
+            </wp:cNvGraphicFramePr>
+            <a:graphic xmlns:a="http://schemas.openxmlformats.org/drawingml/2006/main">
+              <a:graphicData uri="http://schemas.openxmlformats.org/drawingml/2006/picture">
+                <pic:pic xmlns:pic="http://schemas.openxmlformats.org/drawingml/2006/picture">
+                  <pic:nvPicPr>
+                    <pic:cNvPr id="1" name=""/>
+                    <pic:cNvPicPr/>
+                  </pic:nvPicPr>
+                  <pic:blipFill>
+                    <a:blip r:embed="rId9"/>
+                    <a:stretch>
+                      <a:fillRect/>
+                    </a:stretch>
+                  </pic:blipFill>
+                  <pic:spPr>
+                    <a:xfrm>
+                      <a:off x="0" y="0"/>
+                      <a:ext cx="5400040" cy="2707640"/>
+                    </a:xfrm>
+                    <a:prstGeom prst="rect">
+                      <a:avLst/>
+                    </a:prstGeom>
+                  </pic:spPr>
+                </pic:pic>
+              </a:graphicData>
+            </a:graphic>
+          </wp:inline>
+        </w:drawing>
+      </w:r>
+    </w:p>
+    <w:p>
+      <w:pPr>
+        <w:pStyle w:val="Prrafodelista"/>
+        <w:numPr>
+          <w:ilvl w:val="0"/>
+          <w:numId w:val="5"/>
+        </w:numPr>
+        <w:jc w:val="left"/>
+        <w:rPr>
+          <w:rFonts w:ascii="Times New Roman" w:hAnsi="Times New Roman" w:cs="Times New Roman"/>
+          <w:sz w:val="24"/>
+          <w:szCs w:val="24"/>
+          <w:lang w:val="es-ES"/>
+        </w:rPr>
+      </w:pPr>
+      <w:r>
+        <w:rPr>
+          <w:rFonts w:ascii="Times New Roman" w:hAnsi="Times New Roman" w:cs="Times New Roman"/>
+          <w:sz w:val="24"/>
+          <w:szCs w:val="24"/>
+          <w:lang w:val="es-ES"/>
+        </w:rPr>
+        <w:t>Al abrir el terminal integrado deberán colocar los comandos para instalar las librerías y dar “</w:t>
+      </w:r>
+      <w:r>
+        <w:rPr>
+          <w:rFonts w:ascii="Times New Roman" w:hAnsi="Times New Roman" w:cs="Times New Roman"/>
+          <w:b/>
+          <w:sz w:val="24"/>
+          <w:szCs w:val="24"/>
+          <w:lang w:val="es-ES"/>
+        </w:rPr>
+        <w:t>enter</w:t>
+      </w:r>
+      <w:r>
+        <w:rPr>
+          <w:rFonts w:ascii="Times New Roman" w:hAnsi="Times New Roman" w:cs="Times New Roman"/>
+          <w:sz w:val="24"/>
+          <w:szCs w:val="24"/>
+          <w:lang w:val="es-ES"/>
+        </w:rPr>
+        <w:t>” .</w:t>
+      </w:r>
+      <w:r>
+        <w:rPr>
+          <w:rFonts w:ascii="Times New Roman" w:hAnsi="Times New Roman" w:cs="Times New Roman"/>
+          <w:sz w:val="24"/>
+          <w:szCs w:val="24"/>
+          <w:lang w:val="es-ES"/>
+        </w:rPr>
+        <w:br/>
+      </w:r>
+      <w:r>
+        <w:rPr>
+          <w:rFonts w:ascii="Times New Roman" w:hAnsi="Times New Roman" w:cs="Times New Roman"/>
+          <w:sz w:val="24"/>
+          <w:szCs w:val="24"/>
+          <w:lang w:val="es-ES"/>
+        </w:rPr>
+        <w:br/>
+      </w:r>
+      <w:r>
+        <w:rPr>
+          <w:rFonts w:ascii="Times New Roman" w:hAnsi="Times New Roman" w:cs="Times New Roman"/>
+          <w:sz w:val="24"/>
+          <w:szCs w:val="24"/>
+          <w:lang w:val="es-ES"/>
+        </w:rPr>
+        <w:lastRenderedPageBreak/>
+        <w:drawing>
+          <wp:inline distT="0" distB="0" distL="0" distR="0" wp14:anchorId="0E8E92B1" wp14:editId="5416ABCC">
+            <wp:extent cx="5400040" cy="2831465"/>
+            <wp:effectExtent l="0" t="0" r="0" b="6985"/>
+            <wp:docPr id="3" name="Imagen 3"/>
+            <wp:cNvGraphicFramePr>
+              <a:graphicFrameLocks xmlns:a="http://schemas.openxmlformats.org/drawingml/2006/main" noChangeAspect="1"/>
+            </wp:cNvGraphicFramePr>
+            <a:graphic xmlns:a="http://schemas.openxmlformats.org/drawingml/2006/main">
+              <a:graphicData uri="http://schemas.openxmlformats.org/drawingml/2006/picture">
+                <pic:pic xmlns:pic="http://schemas.openxmlformats.org/drawingml/2006/picture">
+                  <pic:nvPicPr>
+                    <pic:cNvPr id="1" name=""/>
+                    <pic:cNvPicPr/>
+                  </pic:nvPicPr>
+                  <pic:blipFill>
+                    <a:blip r:embed="rId10"/>
+                    <a:stretch>
+                      <a:fillRect/>
+                    </a:stretch>
+                  </pic:blipFill>
+                  <pic:spPr>
+                    <a:xfrm>
+                      <a:off x="0" y="0"/>
+                      <a:ext cx="5400040" cy="2831465"/>
+                    </a:xfrm>
+                    <a:prstGeom prst="rect">
+                      <a:avLst/>
+                    </a:prstGeom>
+                  </pic:spPr>
+                </pic:pic>
+              </a:graphicData>
+            </a:graphic>
+          </wp:inline>
+        </w:drawing>
+      </w:r>
+      <w:r>
+        <w:rPr>
+          <w:rFonts w:ascii="Times New Roman" w:hAnsi="Times New Roman" w:cs="Times New Roman"/>
+          <w:sz w:val="24"/>
+          <w:szCs w:val="24"/>
+          <w:lang w:val="es-ES"/>
+        </w:rPr>
+        <w:br/>
+      </w:r>
+      <w:r>
+        <w:rPr>
+          <w:rFonts w:ascii="Times New Roman" w:hAnsi="Times New Roman" w:cs="Times New Roman"/>
+          <w:sz w:val="24"/>
+          <w:szCs w:val="24"/>
+          <w:lang w:val="es-ES"/>
+        </w:rPr>
+        <w:br/>
+      </w:r>
+      <w:r>
+        <w:rPr>
+          <w:rFonts w:ascii="Times New Roman" w:hAnsi="Times New Roman" w:cs="Times New Roman"/>
+          <w:sz w:val="24"/>
+          <w:szCs w:val="24"/>
+          <w:lang w:val="es-ES"/>
+        </w:rPr>
+        <w:drawing>
+          <wp:inline distT="0" distB="0" distL="0" distR="0" wp14:anchorId="199A6F95" wp14:editId="20C4667E">
+            <wp:extent cx="5400040" cy="1080135"/>
+            <wp:effectExtent l="0" t="0" r="0" b="5715"/>
+            <wp:docPr id="5" name="Imagen 5"/>
+            <wp:cNvGraphicFramePr>
+              <a:graphicFrameLocks xmlns:a="http://schemas.openxmlformats.org/drawingml/2006/main" noChangeAspect="1"/>
+            </wp:cNvGraphicFramePr>
+            <a:graphic xmlns:a="http://schemas.openxmlformats.org/drawingml/2006/main">
+              <a:graphicData uri="http://schemas.openxmlformats.org/drawingml/2006/picture">
+                <pic:pic xmlns:pic="http://schemas.openxmlformats.org/drawingml/2006/picture">
+                  <pic:nvPicPr>
+                    <pic:cNvPr id="1" name=""/>
+                    <pic:cNvPicPr/>
+                  </pic:nvPicPr>
+                  <pic:blipFill>
+                    <a:blip r:embed="rId11"/>
+                    <a:stretch>
+                      <a:fillRect/>
+                    </a:stretch>
+                  </pic:blipFill>
+                  <pic:spPr>
+                    <a:xfrm>
+                      <a:off x="0" y="0"/>
+                      <a:ext cx="5400040" cy="1080135"/>
+                    </a:xfrm>
+                    <a:prstGeom prst="rect">
+                      <a:avLst/>
+                    </a:prstGeom>
+                  </pic:spPr>
+                </pic:pic>
+              </a:graphicData>
+            </a:graphic>
+          </wp:inline>
+        </w:drawing>
+      </w:r>
+    </w:p>
+    <w:p>
+      <w:pPr>
+        <w:jc w:val="left"/>
+        <w:rPr>
+          <w:rFonts w:ascii="Times New Roman" w:hAnsi="Times New Roman" w:cs="Times New Roman"/>
+          <w:sz w:val="24"/>
+          <w:szCs w:val="24"/>
+          <w:lang w:val="es-ES"/>
+        </w:rPr>
+      </w:pPr>
+      <w:r>
+        <w:rPr>
+          <w:rFonts w:ascii="Times New Roman" w:hAnsi="Times New Roman" w:cs="Times New Roman"/>
+          <w:sz w:val="24"/>
+          <w:szCs w:val="24"/>
+          <w:lang w:val="es-ES"/>
+        </w:rPr>
+        <w:t>Estos requisitos e instrucciones de instalación también están especificados en el archiv</w:t>
+      </w:r>
+      <w:r>
+        <w:rPr>
+          <w:rFonts w:ascii="Times New Roman" w:hAnsi="Times New Roman" w:cs="Times New Roman"/>
+          <w:sz w:val="24"/>
+          <w:szCs w:val="24"/>
+          <w:lang w:val="es-ES"/>
+        </w:rPr>
+        <w:t>o README.md del repositorio del sistema.</w:t>
+      </w:r>
+      <w:r>
+        <w:rPr>
+          <w:rFonts w:ascii="Times New Roman" w:hAnsi="Times New Roman" w:cs="Times New Roman"/>
+          <w:sz w:val="24"/>
+          <w:szCs w:val="24"/>
+          <w:lang w:val="es-ES"/>
+        </w:rPr>
+        <w:t xml:space="preserve"> </w:t>
+      </w:r>
       <w:r>
         <w:rPr>
           <w:rFonts w:ascii="Times New Roman" w:hAnsi="Times New Roman" w:cs="Times New Roman"/>
@@ -1228,7 +1740,7 @@
                     <pic:cNvPicPr/>
                   </pic:nvPicPr>
                   <pic:blipFill>
-                    <a:blip r:embed="rId8"/>
+                    <a:blip r:embed="rId12"/>
                     <a:stretch>
                       <a:fillRect/>
                     </a:stretch>
@@ -1283,7 +1795,7 @@
                     <pic:cNvPicPr/>
                   </pic:nvPicPr>
                   <pic:blipFill>
-                    <a:blip r:embed="rId9"/>
+                    <a:blip r:embed="rId13"/>
                     <a:stretch>
                       <a:fillRect/>
                     </a:stretch>
@@ -1520,7 +2032,7 @@
                     <pic:cNvPicPr/>
                   </pic:nvPicPr>
                   <pic:blipFill>
-                    <a:blip r:embed="rId10"/>
+                    <a:blip r:embed="rId14"/>
                     <a:stretch>
                       <a:fillRect/>
                     </a:stretch>
@@ -1588,362 +2100,6 @@
             <wp:extent cx="5400040" cy="3577590"/>
             <wp:effectExtent l="0" t="0" r="0" b="3810"/>
             <wp:docPr id="19" name="Imagen 19"/>
-            <wp:cNvGraphicFramePr>
-              <a:graphicFrameLocks xmlns:a="http://schemas.openxmlformats.org/drawingml/2006/main" noChangeAspect="1"/>
-            </wp:cNvGraphicFramePr>
-            <a:graphic xmlns:a="http://schemas.openxmlformats.org/drawingml/2006/main">
-              <a:graphicData uri="http://schemas.openxmlformats.org/drawingml/2006/picture">
-                <pic:pic xmlns:pic="http://schemas.openxmlformats.org/drawingml/2006/picture">
-                  <pic:nvPicPr>
-                    <pic:cNvPr id="1" name=""/>
-                    <pic:cNvPicPr/>
-                  </pic:nvPicPr>
-                  <pic:blipFill>
-                    <a:blip r:embed="rId11"/>
-                    <a:stretch>
-                      <a:fillRect/>
-                    </a:stretch>
-                  </pic:blipFill>
-                  <pic:spPr>
-                    <a:xfrm>
-                      <a:off x="0" y="0"/>
-                      <a:ext cx="5400040" cy="3577590"/>
-                    </a:xfrm>
-                    <a:prstGeom prst="rect">
-                      <a:avLst/>
-                    </a:prstGeom>
-                  </pic:spPr>
-                </pic:pic>
-              </a:graphicData>
-            </a:graphic>
-          </wp:inline>
-        </w:drawing>
-      </w:r>
-      <w:r>
-        <w:rPr>
-          <w:rFonts w:ascii="Times New Roman" w:hAnsi="Times New Roman" w:cs="Times New Roman"/>
-          <w:sz w:val="24"/>
-          <w:szCs w:val="24"/>
-          <w:lang w:val="es-ES"/>
-        </w:rPr>
-        <w:br/>
-      </w:r>
-      <w:r>
-        <w:rPr>
-          <w:rFonts w:ascii="Times New Roman" w:hAnsi="Times New Roman" w:cs="Times New Roman"/>
-          <w:sz w:val="24"/>
-          <w:szCs w:val="24"/>
-          <w:lang w:val="es-ES"/>
-        </w:rPr>
-        <w:br/>
-        <w:t>Aca se puede visualizar el apartado de la vista de la base de conocimientos, los inputs del nombre del filum, característica y el nombre para agregar. Al apretar el símbolo + de cada filum podemos ver las características cargadas.</w:t>
-      </w:r>
-      <w:r>
-        <w:rPr>
-          <w:rFonts w:ascii="Times New Roman" w:hAnsi="Times New Roman" w:cs="Times New Roman"/>
-          <w:sz w:val="24"/>
-          <w:szCs w:val="24"/>
-          <w:lang w:val="es-ES"/>
-        </w:rPr>
-        <w:br/>
-      </w:r>
-      <w:r>
-        <w:rPr>
-          <w:rFonts w:ascii="Times New Roman" w:hAnsi="Times New Roman" w:cs="Times New Roman"/>
-          <w:sz w:val="24"/>
-          <w:szCs w:val="24"/>
-          <w:lang w:val="es-ES"/>
-        </w:rPr>
-        <w:br/>
-      </w:r>
-      <w:r>
-        <w:rPr>
-          <w:noProof/>
-          <w:lang w:val="es-ES" w:eastAsia="es-ES"/>
-        </w:rPr>
-        <w:drawing>
-          <wp:inline distT="0" distB="0" distL="0" distR="0" wp14:anchorId="2490E097" wp14:editId="626E9C65">
-            <wp:extent cx="5400040" cy="3575050"/>
-            <wp:effectExtent l="0" t="0" r="0" b="6350"/>
-            <wp:docPr id="20" name="Imagen 20"/>
-            <wp:cNvGraphicFramePr>
-              <a:graphicFrameLocks xmlns:a="http://schemas.openxmlformats.org/drawingml/2006/main" noChangeAspect="1"/>
-            </wp:cNvGraphicFramePr>
-            <a:graphic xmlns:a="http://schemas.openxmlformats.org/drawingml/2006/main">
-              <a:graphicData uri="http://schemas.openxmlformats.org/drawingml/2006/picture">
-                <pic:pic xmlns:pic="http://schemas.openxmlformats.org/drawingml/2006/picture">
-                  <pic:nvPicPr>
-                    <pic:cNvPr id="1" name=""/>
-                    <pic:cNvPicPr/>
-                  </pic:nvPicPr>
-                  <pic:blipFill>
-                    <a:blip r:embed="rId12"/>
-                    <a:stretch>
-                      <a:fillRect/>
-                    </a:stretch>
-                  </pic:blipFill>
-                  <pic:spPr>
-                    <a:xfrm>
-                      <a:off x="0" y="0"/>
-                      <a:ext cx="5400040" cy="3575050"/>
-                    </a:xfrm>
-                    <a:prstGeom prst="rect">
-                      <a:avLst/>
-                    </a:prstGeom>
-                  </pic:spPr>
-                </pic:pic>
-              </a:graphicData>
-            </a:graphic>
-          </wp:inline>
-        </w:drawing>
-      </w:r>
-      <w:r>
-        <w:rPr>
-          <w:rFonts w:ascii="Times New Roman" w:hAnsi="Times New Roman" w:cs="Times New Roman"/>
-          <w:sz w:val="24"/>
-          <w:szCs w:val="24"/>
-          <w:lang w:val="es-ES"/>
-        </w:rPr>
-        <w:br/>
-      </w:r>
-      <w:r>
-        <w:rPr>
-          <w:rFonts w:ascii="Times New Roman" w:hAnsi="Times New Roman" w:cs="Times New Roman"/>
-          <w:sz w:val="24"/>
-          <w:szCs w:val="24"/>
-          <w:lang w:val="es-ES"/>
-        </w:rPr>
-        <w:br/>
-      </w:r>
-    </w:p>
-    <w:p>
-      <w:pPr>
-        <w:pStyle w:val="Prrafodelista"/>
-        <w:numPr>
-          <w:ilvl w:val="0"/>
-          <w:numId w:val="4"/>
-        </w:numPr>
-        <w:jc w:val="left"/>
-        <w:rPr>
-          <w:rFonts w:ascii="Times New Roman" w:hAnsi="Times New Roman" w:cs="Times New Roman"/>
-          <w:sz w:val="24"/>
-          <w:szCs w:val="24"/>
-          <w:lang w:val="es-ES"/>
-        </w:rPr>
-      </w:pPr>
-      <w:r>
-        <w:rPr>
-          <w:rFonts w:ascii="Times New Roman" w:hAnsi="Times New Roman" w:cs="Times New Roman"/>
-          <w:sz w:val="24"/>
-          <w:szCs w:val="24"/>
-          <w:lang w:val="es-ES"/>
-        </w:rPr>
-        <w:t xml:space="preserve">Consultar:  Esta opción se ubica en el centro de la interfaz y es la función principal del programa, la cual tiene como objetivo el solicitar datos al usuario </w:t>
-      </w:r>
-      <w:r>
-        <w:rPr>
-          <w:rFonts w:ascii="Times New Roman" w:hAnsi="Times New Roman" w:cs="Times New Roman"/>
-          <w:sz w:val="24"/>
-          <w:szCs w:val="24"/>
-          <w:lang w:val="es-ES"/>
-        </w:rPr>
-        <w:lastRenderedPageBreak/>
-        <w:t>referente a los filum, evaluando las reglas ya cargadas para dar una respuesta coherente de acuerdo a las características ingresadas del filum.</w:t>
-      </w:r>
-      <w:r>
-        <w:rPr>
-          <w:rFonts w:ascii="Times New Roman" w:hAnsi="Times New Roman" w:cs="Times New Roman"/>
-          <w:sz w:val="24"/>
-          <w:szCs w:val="24"/>
-          <w:lang w:val="es-ES"/>
-        </w:rPr>
-        <w:br/>
-      </w:r>
-      <w:r>
-        <w:rPr>
-          <w:rFonts w:ascii="Times New Roman" w:hAnsi="Times New Roman" w:cs="Times New Roman"/>
-          <w:sz w:val="24"/>
-          <w:szCs w:val="24"/>
-          <w:lang w:val="es-ES"/>
-        </w:rPr>
-        <w:br/>
-      </w:r>
-      <w:r>
-        <w:rPr>
-          <w:noProof/>
-          <w:lang w:val="es-ES" w:eastAsia="es-ES"/>
-        </w:rPr>
-        <w:drawing>
-          <wp:inline distT="0" distB="0" distL="0" distR="0" wp14:anchorId="406C7013" wp14:editId="33098AF5">
-            <wp:extent cx="5400040" cy="3609340"/>
-            <wp:effectExtent l="0" t="0" r="0" b="0"/>
-            <wp:docPr id="21" name="Imagen 21"/>
-            <wp:cNvGraphicFramePr>
-              <a:graphicFrameLocks xmlns:a="http://schemas.openxmlformats.org/drawingml/2006/main" noChangeAspect="1"/>
-            </wp:cNvGraphicFramePr>
-            <a:graphic xmlns:a="http://schemas.openxmlformats.org/drawingml/2006/main">
-              <a:graphicData uri="http://schemas.openxmlformats.org/drawingml/2006/picture">
-                <pic:pic xmlns:pic="http://schemas.openxmlformats.org/drawingml/2006/picture">
-                  <pic:nvPicPr>
-                    <pic:cNvPr id="1" name=""/>
-                    <pic:cNvPicPr/>
-                  </pic:nvPicPr>
-                  <pic:blipFill>
-                    <a:blip r:embed="rId13"/>
-                    <a:stretch>
-                      <a:fillRect/>
-                    </a:stretch>
-                  </pic:blipFill>
-                  <pic:spPr>
-                    <a:xfrm>
-                      <a:off x="0" y="0"/>
-                      <a:ext cx="5400040" cy="3609340"/>
-                    </a:xfrm>
-                    <a:prstGeom prst="rect">
-                      <a:avLst/>
-                    </a:prstGeom>
-                  </pic:spPr>
-                </pic:pic>
-              </a:graphicData>
-            </a:graphic>
-          </wp:inline>
-        </w:drawing>
-      </w:r>
-      <w:r>
-        <w:rPr>
-          <w:rFonts w:ascii="Times New Roman" w:hAnsi="Times New Roman" w:cs="Times New Roman"/>
-          <w:sz w:val="24"/>
-          <w:szCs w:val="24"/>
-          <w:lang w:val="es-ES"/>
-        </w:rPr>
-        <w:br/>
-      </w:r>
-      <w:r>
-        <w:rPr>
-          <w:rFonts w:ascii="Times New Roman" w:hAnsi="Times New Roman" w:cs="Times New Roman"/>
-          <w:sz w:val="24"/>
-          <w:szCs w:val="24"/>
-          <w:lang w:val="es-ES"/>
-        </w:rPr>
-        <w:br/>
-        <w:t>Al ingresar se nos presentaran las preguntas de acuerdos a las características en la base de conocimiento.</w:t>
-      </w:r>
-      <w:r>
-        <w:rPr>
-          <w:rFonts w:ascii="Times New Roman" w:hAnsi="Times New Roman" w:cs="Times New Roman"/>
-          <w:sz w:val="24"/>
-          <w:szCs w:val="24"/>
-          <w:lang w:val="es-ES"/>
-        </w:rPr>
-        <w:br/>
-      </w:r>
-      <w:r>
-        <w:rPr>
-          <w:rFonts w:ascii="Times New Roman" w:hAnsi="Times New Roman" w:cs="Times New Roman"/>
-          <w:sz w:val="24"/>
-          <w:szCs w:val="24"/>
-          <w:lang w:val="es-ES"/>
-        </w:rPr>
-        <w:br/>
-      </w:r>
-      <w:r>
-        <w:rPr>
-          <w:noProof/>
-          <w:lang w:val="es-ES" w:eastAsia="es-ES"/>
-        </w:rPr>
-        <w:drawing>
-          <wp:inline distT="0" distB="0" distL="0" distR="0" wp14:anchorId="5D7CCAC7" wp14:editId="7DEECAF6">
-            <wp:extent cx="5400040" cy="3579495"/>
-            <wp:effectExtent l="0" t="0" r="0" b="1905"/>
-            <wp:docPr id="22" name="Imagen 22"/>
-            <wp:cNvGraphicFramePr>
-              <a:graphicFrameLocks xmlns:a="http://schemas.openxmlformats.org/drawingml/2006/main" noChangeAspect="1"/>
-            </wp:cNvGraphicFramePr>
-            <a:graphic xmlns:a="http://schemas.openxmlformats.org/drawingml/2006/main">
-              <a:graphicData uri="http://schemas.openxmlformats.org/drawingml/2006/picture">
-                <pic:pic xmlns:pic="http://schemas.openxmlformats.org/drawingml/2006/picture">
-                  <pic:nvPicPr>
-                    <pic:cNvPr id="1" name=""/>
-                    <pic:cNvPicPr/>
-                  </pic:nvPicPr>
-                  <pic:blipFill>
-                    <a:blip r:embed="rId14"/>
-                    <a:stretch>
-                      <a:fillRect/>
-                    </a:stretch>
-                  </pic:blipFill>
-                  <pic:spPr>
-                    <a:xfrm>
-                      <a:off x="0" y="0"/>
-                      <a:ext cx="5400040" cy="3579495"/>
-                    </a:xfrm>
-                    <a:prstGeom prst="rect">
-                      <a:avLst/>
-                    </a:prstGeom>
-                  </pic:spPr>
-                </pic:pic>
-              </a:graphicData>
-            </a:graphic>
-          </wp:inline>
-        </w:drawing>
-      </w:r>
-      <w:r>
-        <w:rPr>
-          <w:rFonts w:ascii="Times New Roman" w:hAnsi="Times New Roman" w:cs="Times New Roman"/>
-          <w:sz w:val="24"/>
-          <w:szCs w:val="24"/>
-          <w:lang w:val="es-ES"/>
-        </w:rPr>
-        <w:br/>
-      </w:r>
-      <w:r>
-        <w:rPr>
-          <w:rFonts w:ascii="Times New Roman" w:hAnsi="Times New Roman" w:cs="Times New Roman"/>
-          <w:sz w:val="24"/>
-          <w:szCs w:val="24"/>
-          <w:lang w:val="es-ES"/>
-        </w:rPr>
-        <w:br/>
-        <w:t xml:space="preserve">De acuerdo a todas las características ingresadas en la base de conocimiento el </w:t>
-      </w:r>
-      <w:r>
-        <w:rPr>
-          <w:rFonts w:ascii="Times New Roman" w:hAnsi="Times New Roman" w:cs="Times New Roman"/>
-          <w:sz w:val="24"/>
-          <w:szCs w:val="24"/>
-          <w:lang w:val="es-ES"/>
-        </w:rPr>
-        <w:lastRenderedPageBreak/>
-        <w:t>sistema evaluara mediante reglas y dará una respuesta simulando el comportamiento de un experto. Al terminar de indicarle que características presenta el Filum el evaluara cual es el que coincide y dará como resultado su descripción y una recopilación de las características que se le dio.</w:t>
-      </w:r>
-      <w:r>
-        <w:rPr>
-          <w:rFonts w:ascii="Times New Roman" w:hAnsi="Times New Roman" w:cs="Times New Roman"/>
-          <w:sz w:val="24"/>
-          <w:szCs w:val="24"/>
-          <w:lang w:val="es-ES"/>
-        </w:rPr>
-        <w:br/>
-      </w:r>
-      <w:r>
-        <w:rPr>
-          <w:rFonts w:ascii="Times New Roman" w:hAnsi="Times New Roman" w:cs="Times New Roman"/>
-          <w:sz w:val="24"/>
-          <w:szCs w:val="24"/>
-          <w:lang w:val="es-ES"/>
-        </w:rPr>
-        <w:br/>
-      </w:r>
-      <w:r>
-        <w:rPr>
-          <w:noProof/>
-          <w:lang w:val="es-ES" w:eastAsia="es-ES"/>
-        </w:rPr>
-        <w:drawing>
-          <wp:inline distT="0" distB="0" distL="0" distR="0" wp14:anchorId="728BECDA" wp14:editId="242674DF">
-            <wp:extent cx="5400040" cy="3577590"/>
-            <wp:effectExtent l="0" t="0" r="0" b="3810"/>
-            <wp:docPr id="23" name="Imagen 23"/>
             <wp:cNvGraphicFramePr>
               <a:graphicFrameLocks xmlns:a="http://schemas.openxmlformats.org/drawingml/2006/main" noChangeAspect="1"/>
             </wp:cNvGraphicFramePr>
@@ -1984,48 +2140,15 @@
         </w:rPr>
         <w:br/>
       </w:r>
-    </w:p>
-    <w:p>
-      <w:pPr>
-        <w:pStyle w:val="Prrafodelista"/>
-        <w:numPr>
-          <w:ilvl w:val="0"/>
-          <w:numId w:val="4"/>
-        </w:numPr>
-        <w:jc w:val="left"/>
-        <w:rPr>
-          <w:rFonts w:ascii="Times New Roman" w:hAnsi="Times New Roman" w:cs="Times New Roman"/>
-          <w:sz w:val="24"/>
-          <w:szCs w:val="24"/>
-          <w:lang w:val="es-ES"/>
-        </w:rPr>
-      </w:pPr>
-      <w:r>
-        <w:rPr>
-          <w:rFonts w:ascii="Times New Roman" w:hAnsi="Times New Roman" w:cs="Times New Roman"/>
-          <w:sz w:val="24"/>
-          <w:szCs w:val="24"/>
-          <w:lang w:val="es-ES"/>
-        </w:rPr>
-        <w:t>Guardar/cargar: Esta opción se usa para cargar el sistema una nueva base de conocimiento o guardar los cambios efectuados a la base de cono</w:t>
-      </w:r>
-      <w:r>
-        <w:rPr>
-          <w:rFonts w:ascii="Times New Roman" w:hAnsi="Times New Roman" w:cs="Times New Roman"/>
-          <w:sz w:val="24"/>
-          <w:szCs w:val="24"/>
-          <w:lang w:val="es-ES"/>
-        </w:rPr>
-        <w:t>ci</w:t>
-      </w:r>
-      <w:r>
-        <w:rPr>
-          <w:rFonts w:ascii="Times New Roman" w:hAnsi="Times New Roman" w:cs="Times New Roman"/>
-          <w:sz w:val="24"/>
-          <w:szCs w:val="24"/>
-          <w:lang w:val="es-ES"/>
-        </w:rPr>
-        <w:t>miento actual, ya que se pueden agregar características, se pone la opción al usuario de guardarlas, Para ello solamente debe decir el nombre del archivo .json que guardara o cargara al sistema.</w:t>
+      <w:r>
+        <w:rPr>
+          <w:rFonts w:ascii="Times New Roman" w:hAnsi="Times New Roman" w:cs="Times New Roman"/>
+          <w:sz w:val="24"/>
+          <w:szCs w:val="24"/>
+          <w:lang w:val="es-ES"/>
+        </w:rPr>
+        <w:br/>
+        <w:t>Aca se puede visualizar el apartado de la vista de la base de conocimientos, los inputs del nombre del filum, característica y el nombre para agregar. Al apretar el símbolo + de cada filum podemos ver las características cargadas.</w:t>
       </w:r>
       <w:r>
         <w:rPr>
@@ -2050,12 +2173,11 @@
           <w:noProof/>
           <w:lang w:val="es-ES" w:eastAsia="es-ES"/>
         </w:rPr>
-        <w:lastRenderedPageBreak/>
         <w:drawing>
-          <wp:inline distT="0" distB="0" distL="0" distR="0" wp14:anchorId="18EF2B37" wp14:editId="667D58C2">
-            <wp:extent cx="5400040" cy="3577590"/>
-            <wp:effectExtent l="0" t="0" r="0" b="3810"/>
-            <wp:docPr id="24" name="Imagen 24"/>
+          <wp:inline distT="0" distB="0" distL="0" distR="0" wp14:anchorId="2490E097" wp14:editId="626E9C65">
+            <wp:extent cx="5400040" cy="3575050"/>
+            <wp:effectExtent l="0" t="0" r="0" b="6350"/>
+            <wp:docPr id="20" name="Imagen 20"/>
             <wp:cNvGraphicFramePr>
               <a:graphicFrameLocks xmlns:a="http://schemas.openxmlformats.org/drawingml/2006/main" noChangeAspect="1"/>
             </wp:cNvGraphicFramePr>
@@ -2075,7 +2197,7 @@
                   <pic:spPr>
                     <a:xfrm>
                       <a:off x="0" y="0"/>
-                      <a:ext cx="5400040" cy="3577590"/>
+                      <a:ext cx="5400040" cy="3575050"/>
                     </a:xfrm>
                     <a:prstGeom prst="rect">
                       <a:avLst/>
@@ -2096,6 +2218,15 @@
         </w:rPr>
         <w:br/>
       </w:r>
+      <w:r>
+        <w:rPr>
+          <w:rFonts w:ascii="Times New Roman" w:hAnsi="Times New Roman" w:cs="Times New Roman"/>
+          <w:sz w:val="24"/>
+          <w:szCs w:val="24"/>
+          <w:lang w:val="es-ES"/>
+        </w:rPr>
+        <w:br/>
+      </w:r>
     </w:p>
     <w:p>
       <w:pPr>
@@ -2119,53 +2250,17 @@
           <w:szCs w:val="24"/>
           <w:lang w:val="es-ES"/>
         </w:rPr>
-        <w:t>Adición</w:t>
-      </w:r>
-      <w:r>
-        <w:rPr>
-          <w:rFonts w:ascii="Times New Roman" w:hAnsi="Times New Roman" w:cs="Times New Roman"/>
-          <w:sz w:val="24"/>
-          <w:szCs w:val="24"/>
-          <w:lang w:val="es-ES"/>
-        </w:rPr>
-        <w:t xml:space="preserve"> de base de conocimiento mediante el código en Python:  En el repositorio hay un archivo “</w:t>
-      </w:r>
-      <w:r>
-        <w:rPr>
-          <w:rFonts w:ascii="Times New Roman" w:hAnsi="Times New Roman" w:cs="Times New Roman"/>
-          <w:b/>
-          <w:sz w:val="24"/>
-          <w:szCs w:val="24"/>
-          <w:lang w:val="es-ES"/>
-        </w:rPr>
-        <w:t>example.json</w:t>
-      </w:r>
-      <w:r>
-        <w:rPr>
-          <w:rFonts w:ascii="Times New Roman" w:hAnsi="Times New Roman" w:cs="Times New Roman"/>
-          <w:sz w:val="24"/>
-          <w:szCs w:val="24"/>
-          <w:lang w:val="es-ES"/>
-        </w:rPr>
-        <w:t xml:space="preserve">” en el que  </w:t>
-      </w:r>
-      <w:r>
-        <w:rPr>
-          <w:rFonts w:ascii="Times New Roman" w:hAnsi="Times New Roman" w:cs="Times New Roman"/>
-          <w:sz w:val="24"/>
-          <w:szCs w:val="24"/>
-          <w:lang w:val="es-ES"/>
-        </w:rPr>
-        <w:t>está</w:t>
-      </w:r>
-      <w:r>
-        <w:rPr>
-          <w:rFonts w:ascii="Times New Roman" w:hAnsi="Times New Roman" w:cs="Times New Roman"/>
-          <w:sz w:val="24"/>
-          <w:szCs w:val="24"/>
-          <w:lang w:val="es-ES"/>
-        </w:rPr>
-        <w:t xml:space="preserve"> un prototipo a seguir para la creación de una base de conocimiento .json.</w:t>
+        <w:t xml:space="preserve">Consultar:  Esta opción se ubica en el centro de la interfaz y es la función principal del programa, la cual tiene como objetivo el solicitar datos al usuario </w:t>
+      </w:r>
+      <w:r>
+        <w:rPr>
+          <w:rFonts w:ascii="Times New Roman" w:hAnsi="Times New Roman" w:cs="Times New Roman"/>
+          <w:sz w:val="24"/>
+          <w:szCs w:val="24"/>
+          <w:lang w:val="es-ES"/>
+        </w:rPr>
+        <w:lastRenderedPageBreak/>
+        <w:t>referente a los filum, evaluando las reglas ya cargadas para dar una respuesta coherente de acuerdo a las características ingresadas del filum.</w:t>
       </w:r>
       <w:r>
         <w:rPr>
@@ -2191,10 +2286,10 @@
           <w:lang w:val="es-ES" w:eastAsia="es-ES"/>
         </w:rPr>
         <w:drawing>
-          <wp:inline distT="0" distB="0" distL="0" distR="0" wp14:anchorId="2D0EAC39" wp14:editId="7A31FB76">
-            <wp:extent cx="5400040" cy="3299460"/>
+          <wp:inline distT="0" distB="0" distL="0" distR="0" wp14:anchorId="406C7013" wp14:editId="33098AF5">
+            <wp:extent cx="5400040" cy="3609340"/>
             <wp:effectExtent l="0" t="0" r="0" b="0"/>
-            <wp:docPr id="13" name="Imagen 13"/>
+            <wp:docPr id="21" name="Imagen 21"/>
             <wp:cNvGraphicFramePr>
               <a:graphicFrameLocks xmlns:a="http://schemas.openxmlformats.org/drawingml/2006/main" noChangeAspect="1"/>
             </wp:cNvGraphicFramePr>
@@ -2214,7 +2309,7 @@
                   <pic:spPr>
                     <a:xfrm>
                       <a:off x="0" y="0"/>
-                      <a:ext cx="5400040" cy="3299460"/>
+                      <a:ext cx="5400040" cy="3609340"/>
                     </a:xfrm>
                     <a:prstGeom prst="rect">
                       <a:avLst/>
@@ -2234,45 +2329,6 @@
           <w:lang w:val="es-ES"/>
         </w:rPr>
         <w:br/>
-        <w:t xml:space="preserve">Podemos ver en descripción el nombre de la </w:t>
-      </w:r>
-      <w:r>
-        <w:rPr>
-          <w:rFonts w:ascii="Times New Roman" w:hAnsi="Times New Roman" w:cs="Times New Roman"/>
-          <w:sz w:val="24"/>
-          <w:szCs w:val="24"/>
-          <w:lang w:val="es-ES"/>
-        </w:rPr>
-        <w:t>base</w:t>
-      </w:r>
-      <w:r>
-        <w:rPr>
-          <w:rFonts w:ascii="Times New Roman" w:hAnsi="Times New Roman" w:cs="Times New Roman"/>
-          <w:sz w:val="24"/>
-          <w:szCs w:val="24"/>
-          <w:lang w:val="es-ES"/>
-        </w:rPr>
-        <w:t xml:space="preserve"> de conocimiento y de atributos las propiedades de esa base con sus características. Teniendo “name” para el nombre, “description” para una </w:t>
-      </w:r>
-      <w:r>
-        <w:rPr>
-          <w:rFonts w:ascii="Times New Roman" w:hAnsi="Times New Roman" w:cs="Times New Roman"/>
-          <w:sz w:val="24"/>
-          <w:szCs w:val="24"/>
-          <w:lang w:val="es-ES"/>
-        </w:rPr>
-        <w:t>definición</w:t>
-      </w:r>
-      <w:bookmarkStart w:id="0" w:name="_GoBack"/>
-      <w:bookmarkEnd w:id="0"/>
-      <w:r>
-        <w:rPr>
-          <w:rFonts w:ascii="Times New Roman" w:hAnsi="Times New Roman" w:cs="Times New Roman"/>
-          <w:sz w:val="24"/>
-          <w:szCs w:val="24"/>
-          <w:lang w:val="es-ES"/>
-        </w:rPr>
-        <w:t xml:space="preserve"> de esa propiedad y “props” para las características de la misma.</w:t>
       </w:r>
       <w:r>
         <w:rPr>
@@ -2282,6 +2338,7 @@
           <w:lang w:val="es-ES"/>
         </w:rPr>
         <w:br/>
+        <w:t>Al ingresar se nos presentaran las preguntas de acuerdos a las características en la base de conocimiento.</w:t>
       </w:r>
       <w:r>
         <w:rPr>
@@ -2291,36 +2348,6 @@
           <w:lang w:val="es-ES"/>
         </w:rPr>
         <w:br/>
-        <w:t xml:space="preserve">Si ingresamos a la carpeta “Base_De_Conocimiento” podemos ver el archivo </w:t>
-      </w:r>
-      <w:r>
-        <w:rPr>
-          <w:rFonts w:ascii="Times New Roman" w:hAnsi="Times New Roman" w:cs="Times New Roman"/>
-          <w:sz w:val="24"/>
-          <w:szCs w:val="24"/>
-          <w:lang w:val="es-ES"/>
-        </w:rPr>
-        <w:lastRenderedPageBreak/>
-        <w:t>“</w:t>
-      </w:r>
-      <w:r>
-        <w:rPr>
-          <w:rFonts w:ascii="Times New Roman" w:hAnsi="Times New Roman" w:cs="Times New Roman"/>
-          <w:b/>
-          <w:sz w:val="24"/>
-          <w:szCs w:val="24"/>
-          <w:lang w:val="es-ES"/>
-        </w:rPr>
-        <w:t>Filumcopy.json</w:t>
-      </w:r>
-      <w:r>
-        <w:rPr>
-          <w:rFonts w:ascii="Times New Roman" w:hAnsi="Times New Roman" w:cs="Times New Roman"/>
-          <w:sz w:val="24"/>
-          <w:szCs w:val="24"/>
-          <w:lang w:val="es-ES"/>
-        </w:rPr>
-        <w:t>” que es donde tenemos cargada la base de conocimientos que se utiliza actualmente.</w:t>
       </w:r>
       <w:r>
         <w:rPr>
@@ -2337,10 +2364,10 @@
           <w:lang w:val="es-ES" w:eastAsia="es-ES"/>
         </w:rPr>
         <w:drawing>
-          <wp:inline distT="0" distB="0" distL="0" distR="0" wp14:anchorId="5CEB1084" wp14:editId="0BB8159F">
-            <wp:extent cx="5400040" cy="2765425"/>
-            <wp:effectExtent l="0" t="0" r="0" b="0"/>
-            <wp:docPr id="25" name="Imagen 25"/>
+          <wp:inline distT="0" distB="0" distL="0" distR="0" wp14:anchorId="5D7CCAC7" wp14:editId="7DEECAF6">
+            <wp:extent cx="5400040" cy="3579495"/>
+            <wp:effectExtent l="0" t="0" r="0" b="1905"/>
+            <wp:docPr id="22" name="Imagen 22"/>
             <wp:cNvGraphicFramePr>
               <a:graphicFrameLocks xmlns:a="http://schemas.openxmlformats.org/drawingml/2006/main" noChangeAspect="1"/>
             </wp:cNvGraphicFramePr>
@@ -2360,7 +2387,7 @@
                   <pic:spPr>
                     <a:xfrm>
                       <a:off x="0" y="0"/>
-                      <a:ext cx="5400040" cy="2765425"/>
+                      <a:ext cx="5400040" cy="3579495"/>
                     </a:xfrm>
                     <a:prstGeom prst="rect">
                       <a:avLst/>
@@ -2389,7 +2416,17 @@
           <w:lang w:val="es-ES"/>
         </w:rPr>
         <w:br/>
-        <w:t>De esta manera podemos modificar la base de conocimiento en el código.</w:t>
+        <w:t xml:space="preserve">De acuerdo a todas las características ingresadas en la base de conocimiento el </w:t>
+      </w:r>
+      <w:r>
+        <w:rPr>
+          <w:rFonts w:ascii="Times New Roman" w:hAnsi="Times New Roman" w:cs="Times New Roman"/>
+          <w:sz w:val="24"/>
+          <w:szCs w:val="24"/>
+          <w:lang w:val="es-ES"/>
+        </w:rPr>
+        <w:lastRenderedPageBreak/>
+        <w:t>sistema evaluara mediante reglas y dará una respuesta simulando el comportamiento de un experto. Al terminar de indicarle que características presenta el Filum el evaluara cual es el que coincide y dará como resultado su descripción y una recopilación de las características que se le dio.</w:t>
       </w:r>
       <w:r>
         <w:rPr>
@@ -2400,50 +2437,6 @@
         </w:rPr>
         <w:br/>
       </w:r>
-    </w:p>
-    <w:p>
-      <w:pPr>
-        <w:pStyle w:val="Prrafodelista"/>
-        <w:numPr>
-          <w:ilvl w:val="0"/>
-          <w:numId w:val="4"/>
-        </w:numPr>
-        <w:jc w:val="left"/>
-        <w:rPr>
-          <w:rFonts w:ascii="Times New Roman" w:hAnsi="Times New Roman" w:cs="Times New Roman"/>
-          <w:sz w:val="24"/>
-          <w:szCs w:val="24"/>
-          <w:lang w:val="es-ES"/>
-        </w:rPr>
-      </w:pPr>
-      <w:r>
-        <w:rPr>
-          <w:rFonts w:ascii="Times New Roman" w:hAnsi="Times New Roman" w:cs="Times New Roman"/>
-          <w:sz w:val="24"/>
-          <w:szCs w:val="24"/>
-          <w:lang w:val="es-ES"/>
-        </w:rPr>
-        <w:t>Imágenes: Las imágenes en el sistema la encontraremos en la carpeta “</w:t>
-      </w:r>
-      <w:r>
-        <w:rPr>
-          <w:rFonts w:ascii="Times New Roman" w:hAnsi="Times New Roman" w:cs="Times New Roman"/>
-          <w:b/>
-          <w:sz w:val="24"/>
-          <w:szCs w:val="24"/>
-          <w:lang w:val="es-ES"/>
-        </w:rPr>
-        <w:t>assets/images</w:t>
-      </w:r>
-      <w:r>
-        <w:rPr>
-          <w:rFonts w:ascii="Times New Roman" w:hAnsi="Times New Roman" w:cs="Times New Roman"/>
-          <w:sz w:val="24"/>
-          <w:szCs w:val="24"/>
-          <w:lang w:val="es-ES"/>
-        </w:rPr>
-        <w:t>” del proyecto.</w:t>
-      </w:r>
       <w:r>
         <w:rPr>
           <w:rFonts w:ascii="Times New Roman" w:hAnsi="Times New Roman" w:cs="Times New Roman"/>
@@ -2453,29 +2446,16 @@
         </w:rPr>
         <w:br/>
       </w:r>
-    </w:p>
-    <w:p>
-      <w:pPr>
-        <w:pStyle w:val="Prrafodelista"/>
-        <w:ind w:left="644" w:firstLine="0"/>
-        <w:jc w:val="left"/>
-        <w:rPr>
-          <w:rFonts w:ascii="Times New Roman" w:hAnsi="Times New Roman" w:cs="Times New Roman"/>
-          <w:sz w:val="24"/>
-          <w:szCs w:val="24"/>
-          <w:lang w:val="es-ES"/>
-        </w:rPr>
-      </w:pPr>
       <w:r>
         <w:rPr>
           <w:noProof/>
           <w:lang w:val="es-ES" w:eastAsia="es-ES"/>
         </w:rPr>
         <w:drawing>
-          <wp:inline distT="0" distB="0" distL="0" distR="0" wp14:anchorId="394E194C" wp14:editId="13993165">
-            <wp:extent cx="2505075" cy="3038475"/>
-            <wp:effectExtent l="0" t="0" r="9525" b="9525"/>
-            <wp:docPr id="26" name="Imagen 26"/>
+          <wp:inline distT="0" distB="0" distL="0" distR="0" wp14:anchorId="728BECDA" wp14:editId="242674DF">
+            <wp:extent cx="5400040" cy="3577590"/>
+            <wp:effectExtent l="0" t="0" r="0" b="3810"/>
+            <wp:docPr id="23" name="Imagen 23"/>
             <wp:cNvGraphicFramePr>
               <a:graphicFrameLocks xmlns:a="http://schemas.openxmlformats.org/drawingml/2006/main" noChangeAspect="1"/>
             </wp:cNvGraphicFramePr>
@@ -2495,6 +2475,536 @@
                   <pic:spPr>
                     <a:xfrm>
                       <a:off x="0" y="0"/>
+                      <a:ext cx="5400040" cy="3577590"/>
+                    </a:xfrm>
+                    <a:prstGeom prst="rect">
+                      <a:avLst/>
+                    </a:prstGeom>
+                  </pic:spPr>
+                </pic:pic>
+              </a:graphicData>
+            </a:graphic>
+          </wp:inline>
+        </w:drawing>
+      </w:r>
+      <w:r>
+        <w:rPr>
+          <w:rFonts w:ascii="Times New Roman" w:hAnsi="Times New Roman" w:cs="Times New Roman"/>
+          <w:sz w:val="24"/>
+          <w:szCs w:val="24"/>
+          <w:lang w:val="es-ES"/>
+        </w:rPr>
+        <w:br/>
+      </w:r>
+    </w:p>
+    <w:p>
+      <w:pPr>
+        <w:pStyle w:val="Prrafodelista"/>
+        <w:numPr>
+          <w:ilvl w:val="0"/>
+          <w:numId w:val="4"/>
+        </w:numPr>
+        <w:jc w:val="left"/>
+        <w:rPr>
+          <w:rFonts w:ascii="Times New Roman" w:hAnsi="Times New Roman" w:cs="Times New Roman"/>
+          <w:sz w:val="24"/>
+          <w:szCs w:val="24"/>
+          <w:lang w:val="es-ES"/>
+        </w:rPr>
+      </w:pPr>
+      <w:r>
+        <w:rPr>
+          <w:rFonts w:ascii="Times New Roman" w:hAnsi="Times New Roman" w:cs="Times New Roman"/>
+          <w:sz w:val="24"/>
+          <w:szCs w:val="24"/>
+          <w:lang w:val="es-ES"/>
+        </w:rPr>
+        <w:t>Guardar/cargar: Esta opción se usa para cargar el sistema una nueva base de conocimiento o guardar los cambios efectuados a la base de cono</w:t>
+      </w:r>
+      <w:r>
+        <w:rPr>
+          <w:rFonts w:ascii="Times New Roman" w:hAnsi="Times New Roman" w:cs="Times New Roman"/>
+          <w:sz w:val="24"/>
+          <w:szCs w:val="24"/>
+          <w:lang w:val="es-ES"/>
+        </w:rPr>
+        <w:t>ci</w:t>
+      </w:r>
+      <w:r>
+        <w:rPr>
+          <w:rFonts w:ascii="Times New Roman" w:hAnsi="Times New Roman" w:cs="Times New Roman"/>
+          <w:sz w:val="24"/>
+          <w:szCs w:val="24"/>
+          <w:lang w:val="es-ES"/>
+        </w:rPr>
+        <w:t>miento actual, ya que se pueden agregar características, se pone la opción al usuario de guardarlas, Para ello solamente debe decir el nombre del archivo .json que guardara o cargara al sistema.</w:t>
+      </w:r>
+      <w:r>
+        <w:rPr>
+          <w:rFonts w:ascii="Times New Roman" w:hAnsi="Times New Roman" w:cs="Times New Roman"/>
+          <w:sz w:val="24"/>
+          <w:szCs w:val="24"/>
+          <w:lang w:val="es-ES"/>
+        </w:rPr>
+        <w:br/>
+      </w:r>
+      <w:r>
+        <w:rPr>
+          <w:rFonts w:ascii="Times New Roman" w:hAnsi="Times New Roman" w:cs="Times New Roman"/>
+          <w:sz w:val="24"/>
+          <w:szCs w:val="24"/>
+          <w:lang w:val="es-ES"/>
+        </w:rPr>
+        <w:br/>
+      </w:r>
+      <w:r>
+        <w:rPr>
+          <w:noProof/>
+          <w:lang w:val="es-ES" w:eastAsia="es-ES"/>
+        </w:rPr>
+        <w:lastRenderedPageBreak/>
+        <w:drawing>
+          <wp:inline distT="0" distB="0" distL="0" distR="0" wp14:anchorId="18EF2B37" wp14:editId="667D58C2">
+            <wp:extent cx="5400040" cy="3577590"/>
+            <wp:effectExtent l="0" t="0" r="0" b="3810"/>
+            <wp:docPr id="24" name="Imagen 24"/>
+            <wp:cNvGraphicFramePr>
+              <a:graphicFrameLocks xmlns:a="http://schemas.openxmlformats.org/drawingml/2006/main" noChangeAspect="1"/>
+            </wp:cNvGraphicFramePr>
+            <a:graphic xmlns:a="http://schemas.openxmlformats.org/drawingml/2006/main">
+              <a:graphicData uri="http://schemas.openxmlformats.org/drawingml/2006/picture">
+                <pic:pic xmlns:pic="http://schemas.openxmlformats.org/drawingml/2006/picture">
+                  <pic:nvPicPr>
+                    <pic:cNvPr id="1" name=""/>
+                    <pic:cNvPicPr/>
+                  </pic:nvPicPr>
+                  <pic:blipFill>
+                    <a:blip r:embed="rId20"/>
+                    <a:stretch>
+                      <a:fillRect/>
+                    </a:stretch>
+                  </pic:blipFill>
+                  <pic:spPr>
+                    <a:xfrm>
+                      <a:off x="0" y="0"/>
+                      <a:ext cx="5400040" cy="3577590"/>
+                    </a:xfrm>
+                    <a:prstGeom prst="rect">
+                      <a:avLst/>
+                    </a:prstGeom>
+                  </pic:spPr>
+                </pic:pic>
+              </a:graphicData>
+            </a:graphic>
+          </wp:inline>
+        </w:drawing>
+      </w:r>
+      <w:r>
+        <w:rPr>
+          <w:rFonts w:ascii="Times New Roman" w:hAnsi="Times New Roman" w:cs="Times New Roman"/>
+          <w:sz w:val="24"/>
+          <w:szCs w:val="24"/>
+          <w:lang w:val="es-ES"/>
+        </w:rPr>
+        <w:br/>
+      </w:r>
+    </w:p>
+    <w:p>
+      <w:pPr>
+        <w:pStyle w:val="Prrafodelista"/>
+        <w:numPr>
+          <w:ilvl w:val="0"/>
+          <w:numId w:val="4"/>
+        </w:numPr>
+        <w:jc w:val="left"/>
+        <w:rPr>
+          <w:rFonts w:ascii="Times New Roman" w:hAnsi="Times New Roman" w:cs="Times New Roman"/>
+          <w:sz w:val="24"/>
+          <w:szCs w:val="24"/>
+          <w:lang w:val="es-ES"/>
+        </w:rPr>
+      </w:pPr>
+      <w:r>
+        <w:rPr>
+          <w:rFonts w:ascii="Times New Roman" w:hAnsi="Times New Roman" w:cs="Times New Roman"/>
+          <w:sz w:val="24"/>
+          <w:szCs w:val="24"/>
+          <w:lang w:val="es-ES"/>
+        </w:rPr>
+        <w:t>Adición</w:t>
+      </w:r>
+      <w:r>
+        <w:rPr>
+          <w:rFonts w:ascii="Times New Roman" w:hAnsi="Times New Roman" w:cs="Times New Roman"/>
+          <w:sz w:val="24"/>
+          <w:szCs w:val="24"/>
+          <w:lang w:val="es-ES"/>
+        </w:rPr>
+        <w:t xml:space="preserve"> de base de conocimiento mediante el código en Python:  En el repositorio hay un archivo “</w:t>
+      </w:r>
+      <w:r>
+        <w:rPr>
+          <w:rFonts w:ascii="Times New Roman" w:hAnsi="Times New Roman" w:cs="Times New Roman"/>
+          <w:b/>
+          <w:sz w:val="24"/>
+          <w:szCs w:val="24"/>
+          <w:lang w:val="es-ES"/>
+        </w:rPr>
+        <w:t>example.json</w:t>
+      </w:r>
+      <w:r>
+        <w:rPr>
+          <w:rFonts w:ascii="Times New Roman" w:hAnsi="Times New Roman" w:cs="Times New Roman"/>
+          <w:sz w:val="24"/>
+          <w:szCs w:val="24"/>
+          <w:lang w:val="es-ES"/>
+        </w:rPr>
+        <w:t xml:space="preserve">” en el que  </w:t>
+      </w:r>
+      <w:r>
+        <w:rPr>
+          <w:rFonts w:ascii="Times New Roman" w:hAnsi="Times New Roman" w:cs="Times New Roman"/>
+          <w:sz w:val="24"/>
+          <w:szCs w:val="24"/>
+          <w:lang w:val="es-ES"/>
+        </w:rPr>
+        <w:t>está</w:t>
+      </w:r>
+      <w:r>
+        <w:rPr>
+          <w:rFonts w:ascii="Times New Roman" w:hAnsi="Times New Roman" w:cs="Times New Roman"/>
+          <w:sz w:val="24"/>
+          <w:szCs w:val="24"/>
+          <w:lang w:val="es-ES"/>
+        </w:rPr>
+        <w:t xml:space="preserve"> un prototipo a seguir para la creación de una base de conocimiento .json.</w:t>
+      </w:r>
+      <w:r>
+        <w:rPr>
+          <w:rFonts w:ascii="Times New Roman" w:hAnsi="Times New Roman" w:cs="Times New Roman"/>
+          <w:sz w:val="24"/>
+          <w:szCs w:val="24"/>
+          <w:lang w:val="es-ES"/>
+        </w:rPr>
+        <w:br/>
+      </w:r>
+      <w:r>
+        <w:rPr>
+          <w:rFonts w:ascii="Times New Roman" w:hAnsi="Times New Roman" w:cs="Times New Roman"/>
+          <w:sz w:val="24"/>
+          <w:szCs w:val="24"/>
+          <w:lang w:val="es-ES"/>
+        </w:rPr>
+        <w:br/>
+      </w:r>
+      <w:r>
+        <w:rPr>
+          <w:noProof/>
+          <w:lang w:val="es-ES" w:eastAsia="es-ES"/>
+        </w:rPr>
+        <w:drawing>
+          <wp:inline distT="0" distB="0" distL="0" distR="0" wp14:anchorId="2D0EAC39" wp14:editId="7A31FB76">
+            <wp:extent cx="5400040" cy="3299460"/>
+            <wp:effectExtent l="0" t="0" r="0" b="0"/>
+            <wp:docPr id="13" name="Imagen 13"/>
+            <wp:cNvGraphicFramePr>
+              <a:graphicFrameLocks xmlns:a="http://schemas.openxmlformats.org/drawingml/2006/main" noChangeAspect="1"/>
+            </wp:cNvGraphicFramePr>
+            <a:graphic xmlns:a="http://schemas.openxmlformats.org/drawingml/2006/main">
+              <a:graphicData uri="http://schemas.openxmlformats.org/drawingml/2006/picture">
+                <pic:pic xmlns:pic="http://schemas.openxmlformats.org/drawingml/2006/picture">
+                  <pic:nvPicPr>
+                    <pic:cNvPr id="1" name=""/>
+                    <pic:cNvPicPr/>
+                  </pic:nvPicPr>
+                  <pic:blipFill>
+                    <a:blip r:embed="rId21"/>
+                    <a:stretch>
+                      <a:fillRect/>
+                    </a:stretch>
+                  </pic:blipFill>
+                  <pic:spPr>
+                    <a:xfrm>
+                      <a:off x="0" y="0"/>
+                      <a:ext cx="5400040" cy="3299460"/>
+                    </a:xfrm>
+                    <a:prstGeom prst="rect">
+                      <a:avLst/>
+                    </a:prstGeom>
+                  </pic:spPr>
+                </pic:pic>
+              </a:graphicData>
+            </a:graphic>
+          </wp:inline>
+        </w:drawing>
+      </w:r>
+      <w:r>
+        <w:rPr>
+          <w:rFonts w:ascii="Times New Roman" w:hAnsi="Times New Roman" w:cs="Times New Roman"/>
+          <w:sz w:val="24"/>
+          <w:szCs w:val="24"/>
+          <w:lang w:val="es-ES"/>
+        </w:rPr>
+        <w:br/>
+        <w:t xml:space="preserve">Podemos ver en descripción el nombre de la </w:t>
+      </w:r>
+      <w:r>
+        <w:rPr>
+          <w:rFonts w:ascii="Times New Roman" w:hAnsi="Times New Roman" w:cs="Times New Roman"/>
+          <w:sz w:val="24"/>
+          <w:szCs w:val="24"/>
+          <w:lang w:val="es-ES"/>
+        </w:rPr>
+        <w:t>base</w:t>
+      </w:r>
+      <w:r>
+        <w:rPr>
+          <w:rFonts w:ascii="Times New Roman" w:hAnsi="Times New Roman" w:cs="Times New Roman"/>
+          <w:sz w:val="24"/>
+          <w:szCs w:val="24"/>
+          <w:lang w:val="es-ES"/>
+        </w:rPr>
+        <w:t xml:space="preserve"> de conocimiento y de atributos las propiedades de esa base con sus características. Teniendo “name” para el nombre, “description” para una </w:t>
+      </w:r>
+      <w:r>
+        <w:rPr>
+          <w:rFonts w:ascii="Times New Roman" w:hAnsi="Times New Roman" w:cs="Times New Roman"/>
+          <w:sz w:val="24"/>
+          <w:szCs w:val="24"/>
+          <w:lang w:val="es-ES"/>
+        </w:rPr>
+        <w:t>definición</w:t>
+      </w:r>
+      <w:r>
+        <w:rPr>
+          <w:rFonts w:ascii="Times New Roman" w:hAnsi="Times New Roman" w:cs="Times New Roman"/>
+          <w:sz w:val="24"/>
+          <w:szCs w:val="24"/>
+          <w:lang w:val="es-ES"/>
+        </w:rPr>
+        <w:t xml:space="preserve"> de esa propiedad y “props” para las características de la misma.</w:t>
+      </w:r>
+      <w:r>
+        <w:rPr>
+          <w:rFonts w:ascii="Times New Roman" w:hAnsi="Times New Roman" w:cs="Times New Roman"/>
+          <w:sz w:val="24"/>
+          <w:szCs w:val="24"/>
+          <w:lang w:val="es-ES"/>
+        </w:rPr>
+        <w:br/>
+      </w:r>
+      <w:r>
+        <w:rPr>
+          <w:rFonts w:ascii="Times New Roman" w:hAnsi="Times New Roman" w:cs="Times New Roman"/>
+          <w:sz w:val="24"/>
+          <w:szCs w:val="24"/>
+          <w:lang w:val="es-ES"/>
+        </w:rPr>
+        <w:br/>
+        <w:t xml:space="preserve">Si ingresamos a la carpeta “Base_De_Conocimiento” podemos ver el archivo </w:t>
+      </w:r>
+      <w:r>
+        <w:rPr>
+          <w:rFonts w:ascii="Times New Roman" w:hAnsi="Times New Roman" w:cs="Times New Roman"/>
+          <w:sz w:val="24"/>
+          <w:szCs w:val="24"/>
+          <w:lang w:val="es-ES"/>
+        </w:rPr>
+        <w:lastRenderedPageBreak/>
+        <w:t>“</w:t>
+      </w:r>
+      <w:r>
+        <w:rPr>
+          <w:rFonts w:ascii="Times New Roman" w:hAnsi="Times New Roman" w:cs="Times New Roman"/>
+          <w:b/>
+          <w:sz w:val="24"/>
+          <w:szCs w:val="24"/>
+          <w:lang w:val="es-ES"/>
+        </w:rPr>
+        <w:t>Filumcopy.json</w:t>
+      </w:r>
+      <w:r>
+        <w:rPr>
+          <w:rFonts w:ascii="Times New Roman" w:hAnsi="Times New Roman" w:cs="Times New Roman"/>
+          <w:sz w:val="24"/>
+          <w:szCs w:val="24"/>
+          <w:lang w:val="es-ES"/>
+        </w:rPr>
+        <w:t>” que es donde tenemos cargada la base de conocimientos que se utiliza actualmente.</w:t>
+      </w:r>
+      <w:r>
+        <w:rPr>
+          <w:rFonts w:ascii="Times New Roman" w:hAnsi="Times New Roman" w:cs="Times New Roman"/>
+          <w:sz w:val="24"/>
+          <w:szCs w:val="24"/>
+          <w:lang w:val="es-ES"/>
+        </w:rPr>
+        <w:br/>
+      </w:r>
+      <w:r>
+        <w:rPr>
+          <w:noProof/>
+          <w:lang w:val="es-ES" w:eastAsia="es-ES"/>
+        </w:rPr>
+        <w:drawing>
+          <wp:inline distT="0" distB="0" distL="0" distR="0" wp14:anchorId="5CEB1084" wp14:editId="0BB8159F">
+            <wp:extent cx="5400040" cy="2765425"/>
+            <wp:effectExtent l="0" t="0" r="0" b="0"/>
+            <wp:docPr id="25" name="Imagen 25"/>
+            <wp:cNvGraphicFramePr>
+              <a:graphicFrameLocks xmlns:a="http://schemas.openxmlformats.org/drawingml/2006/main" noChangeAspect="1"/>
+            </wp:cNvGraphicFramePr>
+            <a:graphic xmlns:a="http://schemas.openxmlformats.org/drawingml/2006/main">
+              <a:graphicData uri="http://schemas.openxmlformats.org/drawingml/2006/picture">
+                <pic:pic xmlns:pic="http://schemas.openxmlformats.org/drawingml/2006/picture">
+                  <pic:nvPicPr>
+                    <pic:cNvPr id="1" name=""/>
+                    <pic:cNvPicPr/>
+                  </pic:nvPicPr>
+                  <pic:blipFill>
+                    <a:blip r:embed="rId22"/>
+                    <a:stretch>
+                      <a:fillRect/>
+                    </a:stretch>
+                  </pic:blipFill>
+                  <pic:spPr>
+                    <a:xfrm>
+                      <a:off x="0" y="0"/>
+                      <a:ext cx="5400040" cy="2765425"/>
+                    </a:xfrm>
+                    <a:prstGeom prst="rect">
+                      <a:avLst/>
+                    </a:prstGeom>
+                  </pic:spPr>
+                </pic:pic>
+              </a:graphicData>
+            </a:graphic>
+          </wp:inline>
+        </w:drawing>
+      </w:r>
+      <w:r>
+        <w:rPr>
+          <w:rFonts w:ascii="Times New Roman" w:hAnsi="Times New Roman" w:cs="Times New Roman"/>
+          <w:sz w:val="24"/>
+          <w:szCs w:val="24"/>
+          <w:lang w:val="es-ES"/>
+        </w:rPr>
+        <w:br/>
+      </w:r>
+      <w:r>
+        <w:rPr>
+          <w:rFonts w:ascii="Times New Roman" w:hAnsi="Times New Roman" w:cs="Times New Roman"/>
+          <w:sz w:val="24"/>
+          <w:szCs w:val="24"/>
+          <w:lang w:val="es-ES"/>
+        </w:rPr>
+        <w:br/>
+        <w:t>De esta manera podemos modificar la base de conocimiento en el código.</w:t>
+      </w:r>
+      <w:r>
+        <w:rPr>
+          <w:rFonts w:ascii="Times New Roman" w:hAnsi="Times New Roman" w:cs="Times New Roman"/>
+          <w:sz w:val="24"/>
+          <w:szCs w:val="24"/>
+          <w:lang w:val="es-ES"/>
+        </w:rPr>
+        <w:br/>
+      </w:r>
+    </w:p>
+    <w:p>
+      <w:pPr>
+        <w:pStyle w:val="Prrafodelista"/>
+        <w:numPr>
+          <w:ilvl w:val="0"/>
+          <w:numId w:val="4"/>
+        </w:numPr>
+        <w:jc w:val="left"/>
+        <w:rPr>
+          <w:rFonts w:ascii="Times New Roman" w:hAnsi="Times New Roman" w:cs="Times New Roman"/>
+          <w:sz w:val="24"/>
+          <w:szCs w:val="24"/>
+          <w:lang w:val="es-ES"/>
+        </w:rPr>
+      </w:pPr>
+      <w:r>
+        <w:rPr>
+          <w:rFonts w:ascii="Times New Roman" w:hAnsi="Times New Roman" w:cs="Times New Roman"/>
+          <w:sz w:val="24"/>
+          <w:szCs w:val="24"/>
+          <w:lang w:val="es-ES"/>
+        </w:rPr>
+        <w:t>Imágenes: Las imágenes en el sistema la encontraremos en la carpeta “</w:t>
+      </w:r>
+      <w:r>
+        <w:rPr>
+          <w:rFonts w:ascii="Times New Roman" w:hAnsi="Times New Roman" w:cs="Times New Roman"/>
+          <w:b/>
+          <w:sz w:val="24"/>
+          <w:szCs w:val="24"/>
+          <w:lang w:val="es-ES"/>
+        </w:rPr>
+        <w:t>assets/images</w:t>
+      </w:r>
+      <w:r>
+        <w:rPr>
+          <w:rFonts w:ascii="Times New Roman" w:hAnsi="Times New Roman" w:cs="Times New Roman"/>
+          <w:sz w:val="24"/>
+          <w:szCs w:val="24"/>
+          <w:lang w:val="es-ES"/>
+        </w:rPr>
+        <w:t>” del proyecto.</w:t>
+      </w:r>
+      <w:r>
+        <w:rPr>
+          <w:rFonts w:ascii="Times New Roman" w:hAnsi="Times New Roman" w:cs="Times New Roman"/>
+          <w:sz w:val="24"/>
+          <w:szCs w:val="24"/>
+          <w:lang w:val="es-ES"/>
+        </w:rPr>
+        <w:br/>
+      </w:r>
+    </w:p>
+    <w:p>
+      <w:pPr>
+        <w:pStyle w:val="Prrafodelista"/>
+        <w:ind w:left="644" w:firstLine="0"/>
+        <w:jc w:val="left"/>
+        <w:rPr>
+          <w:rFonts w:ascii="Times New Roman" w:hAnsi="Times New Roman" w:cs="Times New Roman"/>
+          <w:sz w:val="24"/>
+          <w:szCs w:val="24"/>
+          <w:lang w:val="es-ES"/>
+        </w:rPr>
+      </w:pPr>
+      <w:r>
+        <w:rPr>
+          <w:noProof/>
+          <w:lang w:val="es-ES" w:eastAsia="es-ES"/>
+        </w:rPr>
+        <w:drawing>
+          <wp:inline distT="0" distB="0" distL="0" distR="0" wp14:anchorId="394E194C" wp14:editId="13993165">
+            <wp:extent cx="2505075" cy="3038475"/>
+            <wp:effectExtent l="0" t="0" r="9525" b="9525"/>
+            <wp:docPr id="26" name="Imagen 26"/>
+            <wp:cNvGraphicFramePr>
+              <a:graphicFrameLocks xmlns:a="http://schemas.openxmlformats.org/drawingml/2006/main" noChangeAspect="1"/>
+            </wp:cNvGraphicFramePr>
+            <a:graphic xmlns:a="http://schemas.openxmlformats.org/drawingml/2006/main">
+              <a:graphicData uri="http://schemas.openxmlformats.org/drawingml/2006/picture">
+                <pic:pic xmlns:pic="http://schemas.openxmlformats.org/drawingml/2006/picture">
+                  <pic:nvPicPr>
+                    <pic:cNvPr id="1" name=""/>
+                    <pic:cNvPicPr/>
+                  </pic:nvPicPr>
+                  <pic:blipFill>
+                    <a:blip r:embed="rId23"/>
+                    <a:stretch>
+                      <a:fillRect/>
+                    </a:stretch>
+                  </pic:blipFill>
+                  <pic:spPr>
+                    <a:xfrm>
+                      <a:off x="0" y="0"/>
                       <a:ext cx="2505075" cy="3038475"/>
                     </a:xfrm>
                     <a:prstGeom prst="rect">
@@ -2612,7 +3122,7 @@
                     <pic:cNvPicPr/>
                   </pic:nvPicPr>
                   <pic:blipFill>
-                    <a:blip r:embed="rId20"/>
+                    <a:blip r:embed="rId24"/>
                     <a:stretch>
                       <a:fillRect/>
                     </a:stretch>
@@ -2847,6 +3357,95 @@
     </w:lvl>
   </w:abstractNum>
   <w:abstractNum w:abstractNumId="2" w15:restartNumberingAfterBreak="0">
+    <w:nsid w:val="57E65F50"/>
+    <w:multiLevelType w:val="hybridMultilevel"/>
+    <w:tmpl w:val="2E5E1640"/>
+    <w:lvl w:ilvl="0" w:tplc="6F360D08">
+      <w:start w:val="1"/>
+      <w:numFmt w:val="decimal"/>
+      <w:lvlText w:val="%1."/>
+      <w:lvlJc w:val="left"/>
+      <w:pPr>
+        <w:ind w:left="644" w:hanging="360"/>
+      </w:pPr>
+      <w:rPr>
+        <w:rFonts w:hint="default"/>
+      </w:rPr>
+    </w:lvl>
+    <w:lvl w:ilvl="1" w:tplc="0C0A0019" w:tentative="1">
+      <w:start w:val="1"/>
+      <w:numFmt w:val="lowerLetter"/>
+      <w:lvlText w:val="%2."/>
+      <w:lvlJc w:val="left"/>
+      <w:pPr>
+        <w:ind w:left="1364" w:hanging="360"/>
+      </w:pPr>
+    </w:lvl>
+    <w:lvl w:ilvl="2" w:tplc="0C0A001B" w:tentative="1">
+      <w:start w:val="1"/>
+      <w:numFmt w:val="lowerRoman"/>
+      <w:lvlText w:val="%3."/>
+      <w:lvlJc w:val="right"/>
+      <w:pPr>
+        <w:ind w:left="2084" w:hanging="180"/>
+      </w:pPr>
+    </w:lvl>
+    <w:lvl w:ilvl="3" w:tplc="0C0A000F" w:tentative="1">
+      <w:start w:val="1"/>
+      <w:numFmt w:val="decimal"/>
+      <w:lvlText w:val="%4."/>
+      <w:lvlJc w:val="left"/>
+      <w:pPr>
+        <w:ind w:left="2804" w:hanging="360"/>
+      </w:pPr>
+    </w:lvl>
+    <w:lvl w:ilvl="4" w:tplc="0C0A0019" w:tentative="1">
+      <w:start w:val="1"/>
+      <w:numFmt w:val="lowerLetter"/>
+      <w:lvlText w:val="%5."/>
+      <w:lvlJc w:val="left"/>
+      <w:pPr>
+        <w:ind w:left="3524" w:hanging="360"/>
+      </w:pPr>
+    </w:lvl>
+    <w:lvl w:ilvl="5" w:tplc="0C0A001B" w:tentative="1">
+      <w:start w:val="1"/>
+      <w:numFmt w:val="lowerRoman"/>
+      <w:lvlText w:val="%6."/>
+      <w:lvlJc w:val="right"/>
+      <w:pPr>
+        <w:ind w:left="4244" w:hanging="180"/>
+      </w:pPr>
+    </w:lvl>
+    <w:lvl w:ilvl="6" w:tplc="0C0A000F" w:tentative="1">
+      <w:start w:val="1"/>
+      <w:numFmt w:val="decimal"/>
+      <w:lvlText w:val="%7."/>
+      <w:lvlJc w:val="left"/>
+      <w:pPr>
+        <w:ind w:left="4964" w:hanging="360"/>
+      </w:pPr>
+    </w:lvl>
+    <w:lvl w:ilvl="7" w:tplc="0C0A0019" w:tentative="1">
+      <w:start w:val="1"/>
+      <w:numFmt w:val="lowerLetter"/>
+      <w:lvlText w:val="%8."/>
+      <w:lvlJc w:val="left"/>
+      <w:pPr>
+        <w:ind w:left="5684" w:hanging="360"/>
+      </w:pPr>
+    </w:lvl>
+    <w:lvl w:ilvl="8" w:tplc="0C0A001B" w:tentative="1">
+      <w:start w:val="1"/>
+      <w:numFmt w:val="lowerRoman"/>
+      <w:lvlText w:val="%9."/>
+      <w:lvlJc w:val="right"/>
+      <w:pPr>
+        <w:ind w:left="6404" w:hanging="180"/>
+      </w:pPr>
+    </w:lvl>
+  </w:abstractNum>
+  <w:abstractNum w:abstractNumId="3" w15:restartNumberingAfterBreak="0">
     <w:nsid w:val="5B202465"/>
     <w:multiLevelType w:val="hybridMultilevel"/>
     <w:tmpl w:val="E166AAB4"/>
@@ -2959,7 +3558,7 @@
       </w:rPr>
     </w:lvl>
   </w:abstractNum>
-  <w:abstractNum w:abstractNumId="3" w15:restartNumberingAfterBreak="0">
+  <w:abstractNum w:abstractNumId="4" w15:restartNumberingAfterBreak="0">
     <w:nsid w:val="77BE0648"/>
     <w:multiLevelType w:val="hybridMultilevel"/>
     <w:tmpl w:val="9B2688CC"/>
@@ -3075,13 +3674,16 @@
     <w:abstractNumId w:val="1"/>
   </w:num>
   <w:num w:numId="2">
-    <w:abstractNumId w:val="3"/>
+    <w:abstractNumId w:val="4"/>
   </w:num>
   <w:num w:numId="3">
-    <w:abstractNumId w:val="2"/>
+    <w:abstractNumId w:val="3"/>
   </w:num>
   <w:num w:numId="4">
     <w:abstractNumId w:val="0"/>
+  </w:num>
+  <w:num w:numId="5">
+    <w:abstractNumId w:val="2"/>
   </w:num>
 </w:numbering>
 </file>
@@ -3538,6 +4140,18 @@
       <w:u w:val="single"/>
     </w:rPr>
   </w:style>
+  <w:style w:type="character" w:styleId="Hipervnculovisitado">
+    <w:name w:val="FollowedHyperlink"/>
+    <w:basedOn w:val="Fuentedeprrafopredeter"/>
+    <w:uiPriority w:val="99"/>
+    <w:semiHidden/>
+    <w:unhideWhenUsed/>
+    <w:rsid w:val="004E31E7"/>
+    <w:rPr>
+      <w:color w:val="954F72" w:themeColor="followedHyperlink"/>
+      <w:u w:val="single"/>
+    </w:rPr>
+  </w:style>
 </w:styles>
 </file>
 
@@ -3807,7 +4421,7 @@
 </file>
 
 <file path=customXml/itemProps1.xml><?xml version="1.0" encoding="utf-8"?>
-<ds:datastoreItem xmlns:ds="http://schemas.openxmlformats.org/officeDocument/2006/customXml" ds:itemID="{5990936F-990B-450B-B84A-0BF232747599}">
+<ds:datastoreItem xmlns:ds="http://schemas.openxmlformats.org/officeDocument/2006/customXml" ds:itemID="{AA837CFC-AE70-467E-B9DE-800EFEB0556B}">
   <ds:schemaRefs>
     <ds:schemaRef ds:uri="http://schemas.openxmlformats.org/officeDocument/2006/bibliography"/>
   </ds:schemaRefs>

</xml_diff>